<commit_message>
docs: expand UMI user manual with 5 new screenshot illustrations for interactive workflows
</commit_message>
<xml_diff>
--- a/docs/ProjectPulse_User_Manual.docx
+++ b/docs/ProjectPulse_User_Manual.docx
@@ -1026,7 +1026,7 @@
         <w:rPr>
           <w:sz w:val="21"/>
         </w:rPr>
-        <w:t>ProjectPulse loads with a pre-populated sample project so you can explore immediately.</w:t>
+        <w:t>ProjectPulse loads with a welcome landing page. Click 'Enter' or 'Open App' to enter the main dashboard.</w:t>
       </w:r>
     </w:p>
     <w:p>
@@ -1039,6 +1039,60 @@
           <w:sz w:val="21"/>
         </w:rPr>
         <w:t>To start a fresh project: click Settings (gear icon) -&gt; General -&gt; 'Reset Project'. Enter your project name and click Save.</w:t>
+      </w:r>
+    </w:p>
+    <w:p>
+      <w:pPr>
+        <w:spacing w:before="160" w:after="0"/>
+        <w:jc w:val="center"/>
+      </w:pPr>
+      <w:r>
+        <w:drawing>
+          <wp:inline xmlns:a="http://schemas.openxmlformats.org/drawingml/2006/main" xmlns:pic="http://schemas.openxmlformats.org/drawingml/2006/picture">
+            <wp:extent cx="5760720" cy="3240405"/>
+            <wp:docPr id="1" name="Picture 1"/>
+            <wp:cNvGraphicFramePr>
+              <a:graphicFrameLocks noChangeAspect="1"/>
+            </wp:cNvGraphicFramePr>
+            <a:graphic>
+              <a:graphicData uri="http://schemas.openxmlformats.org/drawingml/2006/picture">
+                <pic:pic>
+                  <pic:nvPicPr>
+                    <pic:cNvPr id="0" name="15_landing_page.png"/>
+                    <pic:cNvPicPr/>
+                  </pic:nvPicPr>
+                  <pic:blipFill>
+                    <a:blip r:embed="rId10"/>
+                    <a:stretch>
+                      <a:fillRect/>
+                    </a:stretch>
+                  </pic:blipFill>
+                  <pic:spPr>
+                    <a:xfrm>
+                      <a:off x="0" y="0"/>
+                      <a:ext cx="5760720" cy="3240405"/>
+                    </a:xfrm>
+                    <a:prstGeom prst="rect"/>
+                  </pic:spPr>
+                </pic:pic>
+              </a:graphicData>
+            </a:graphic>
+          </wp:inline>
+        </w:drawing>
+      </w:r>
+    </w:p>
+    <w:p>
+      <w:pPr>
+        <w:spacing w:before="80" w:after="280"/>
+        <w:jc w:val="center"/>
+      </w:pPr>
+      <w:r>
+        <w:rPr>
+          <w:i/>
+          <w:color w:val="6C757D"/>
+          <w:sz w:val="18"/>
+        </w:rPr>
+        <w:t>Figure 1.1 — The Welcome/Landing page of ProjectPulse before entering the main workspace.</w:t>
       </w:r>
     </w:p>
     <w:p/>
@@ -1897,7 +1951,7 @@
         <w:drawing>
           <wp:inline xmlns:a="http://schemas.openxmlformats.org/drawingml/2006/main" xmlns:pic="http://schemas.openxmlformats.org/drawingml/2006/picture">
             <wp:extent cx="5760720" cy="3240405"/>
-            <wp:docPr id="1" name="Picture 1"/>
+            <wp:docPr id="2" name="Picture 2"/>
             <wp:cNvGraphicFramePr>
               <a:graphicFrameLocks noChangeAspect="1"/>
             </wp:cNvGraphicFramePr>
@@ -1909,7 +1963,7 @@
                     <pic:cNvPicPr/>
                   </pic:nvPicPr>
                   <pic:blipFill>
-                    <a:blip r:embed="rId10"/>
+                    <a:blip r:embed="rId11"/>
                     <a:stretch>
                       <a:fillRect/>
                     </a:stretch>
@@ -2814,7 +2868,7 @@
         <w:drawing>
           <wp:inline xmlns:a="http://schemas.openxmlformats.org/drawingml/2006/main" xmlns:pic="http://schemas.openxmlformats.org/drawingml/2006/picture">
             <wp:extent cx="5760720" cy="3240405"/>
-            <wp:docPr id="2" name="Picture 2"/>
+            <wp:docPr id="3" name="Picture 3"/>
             <wp:cNvGraphicFramePr>
               <a:graphicFrameLocks noChangeAspect="1"/>
             </wp:cNvGraphicFramePr>
@@ -2826,7 +2880,7 @@
                     <pic:cNvPicPr/>
                   </pic:nvPicPr>
                   <pic:blipFill>
-                    <a:blip r:embed="rId11"/>
+                    <a:blip r:embed="rId12"/>
                     <a:stretch>
                       <a:fillRect/>
                     </a:stretch>
@@ -2892,7 +2946,7 @@
         <w:rPr>
           <w:sz w:val="21"/>
         </w:rPr>
-        <w:t>A new row appears at the bottom of the task list with default values.</w:t>
+        <w:t>Alternatively, open the Task Flyout detailed panel by clicking the task detail/edit button.</w:t>
       </w:r>
     </w:p>
     <w:p>
@@ -2904,7 +2958,7 @@
         <w:rPr>
           <w:sz w:val="21"/>
         </w:rPr>
-        <w:t>Click any field in the row to start editing it inline.</w:t>
+        <w:t>A comprehensive form appears with fields for name, assignee, status, priority, complexity, dates, and dependencies.</w:t>
       </w:r>
     </w:p>
     <w:p>
@@ -2916,31 +2970,61 @@
         <w:rPr>
           <w:sz w:val="21"/>
         </w:rPr>
-        <w:t>Enter the task name, then press Tab to move to the next field.</w:t>
+        <w:t>Fill in the details and click 'Save Task'.</w:t>
       </w:r>
     </w:p>
     <w:p>
       <w:pPr>
-        <w:pStyle w:val="ListNumber"/>
-        <w:spacing w:before="0" w:after="60"/>
+        <w:spacing w:before="160" w:after="0"/>
+        <w:jc w:val="center"/>
+      </w:pPr>
+      <w:r>
+        <w:drawing>
+          <wp:inline xmlns:a="http://schemas.openxmlformats.org/drawingml/2006/main" xmlns:pic="http://schemas.openxmlformats.org/drawingml/2006/picture">
+            <wp:extent cx="5760720" cy="3240405"/>
+            <wp:docPr id="4" name="Picture 4"/>
+            <wp:cNvGraphicFramePr>
+              <a:graphicFrameLocks noChangeAspect="1"/>
+            </wp:cNvGraphicFramePr>
+            <a:graphic>
+              <a:graphicData uri="http://schemas.openxmlformats.org/drawingml/2006/picture">
+                <pic:pic>
+                  <pic:nvPicPr>
+                    <pic:cNvPr id="0" name="11_add_task_flyout.png"/>
+                    <pic:cNvPicPr/>
+                  </pic:nvPicPr>
+                  <pic:blipFill>
+                    <a:blip r:embed="rId13"/>
+                    <a:stretch>
+                      <a:fillRect/>
+                    </a:stretch>
+                  </pic:blipFill>
+                  <pic:spPr>
+                    <a:xfrm>
+                      <a:off x="0" y="0"/>
+                      <a:ext cx="5760720" cy="3240405"/>
+                    </a:xfrm>
+                    <a:prstGeom prst="rect"/>
+                  </pic:spPr>
+                </pic:pic>
+              </a:graphicData>
+            </a:graphic>
+          </wp:inline>
+        </w:drawing>
+      </w:r>
+    </w:p>
+    <w:p>
+      <w:pPr>
+        <w:spacing w:before="80" w:after="280"/>
+        <w:jc w:val="center"/>
       </w:pPr>
       <w:r>
         <w:rPr>
-          <w:sz w:val="21"/>
+          <w:i/>
+          <w:color w:val="6C757D"/>
+          <w:sz w:val="18"/>
         </w:rPr>
-        <w:t>Set the Status (defaults to 'Not Started'), Assignee, Priority, Start Date, and Due Date.</w:t>
-      </w:r>
-    </w:p>
-    <w:p>
-      <w:pPr>
-        <w:pStyle w:val="ListNumber"/>
-        <w:spacing w:before="0" w:after="60"/>
-      </w:pPr>
-      <w:r>
-        <w:rPr>
-          <w:sz w:val="21"/>
-        </w:rPr>
-        <w:t>Press Enter on the last field or click anywhere else to save the row.</w:t>
+        <w:t>Figure 4.2 — The interactive Task Details flyout panel showing comprehensive fields and subtask lists.</w:t>
       </w:r>
     </w:p>
     <w:p/>
@@ -3397,7 +3481,7 @@
         <w:drawing>
           <wp:inline xmlns:a="http://schemas.openxmlformats.org/drawingml/2006/main" xmlns:pic="http://schemas.openxmlformats.org/drawingml/2006/picture">
             <wp:extent cx="5760720" cy="3240405"/>
-            <wp:docPr id="3" name="Picture 3"/>
+            <wp:docPr id="5" name="Picture 5"/>
             <wp:cNvGraphicFramePr>
               <a:graphicFrameLocks noChangeAspect="1"/>
             </wp:cNvGraphicFramePr>
@@ -3409,7 +3493,7 @@
                     <pic:cNvPicPr/>
                   </pic:nvPicPr>
                   <pic:blipFill>
-                    <a:blip r:embed="rId12"/>
+                    <a:blip r:embed="rId14"/>
                     <a:stretch>
                       <a:fillRect/>
                     </a:stretch>
@@ -3748,7 +3832,7 @@
         <w:drawing>
           <wp:inline xmlns:a="http://schemas.openxmlformats.org/drawingml/2006/main" xmlns:pic="http://schemas.openxmlformats.org/drawingml/2006/picture">
             <wp:extent cx="5760720" cy="3240405"/>
-            <wp:docPr id="4" name="Picture 4"/>
+            <wp:docPr id="6" name="Picture 6"/>
             <wp:cNvGraphicFramePr>
               <a:graphicFrameLocks noChangeAspect="1"/>
             </wp:cNvGraphicFramePr>
@@ -3760,7 +3844,7 @@
                     <pic:cNvPicPr/>
                   </pic:nvPicPr>
                   <pic:blipFill>
-                    <a:blip r:embed="rId13"/>
+                    <a:blip r:embed="rId15"/>
                     <a:stretch>
                       <a:fillRect/>
                     </a:stretch>
@@ -4174,7 +4258,7 @@
         <w:drawing>
           <wp:inline xmlns:a="http://schemas.openxmlformats.org/drawingml/2006/main" xmlns:pic="http://schemas.openxmlformats.org/drawingml/2006/picture">
             <wp:extent cx="5760720" cy="3240405"/>
-            <wp:docPr id="5" name="Picture 5"/>
+            <wp:docPr id="7" name="Picture 7"/>
             <wp:cNvGraphicFramePr>
               <a:graphicFrameLocks noChangeAspect="1"/>
             </wp:cNvGraphicFramePr>
@@ -4186,7 +4270,7 @@
                     <pic:cNvPicPr/>
                   </pic:nvPicPr>
                   <pic:blipFill>
-                    <a:blip r:embed="rId14"/>
+                    <a:blip r:embed="rId16"/>
                     <a:stretch>
                       <a:fillRect/>
                     </a:stretch>
@@ -4264,6 +4348,18 @@
         <w:rPr>
           <w:sz w:val="21"/>
         </w:rPr>
+        <w:t>The RAID logging flyout panel appears, allowing comprehensive details to be set.</w:t>
+      </w:r>
+    </w:p>
+    <w:p>
+      <w:pPr>
+        <w:pStyle w:val="ListNumber"/>
+        <w:spacing w:before="0" w:after="60"/>
+      </w:pPr>
+      <w:r>
+        <w:rPr>
+          <w:sz w:val="21"/>
+        </w:rPr>
         <w:t>Select the Type: Risk / Assumption / Issue / Dependency.</w:t>
       </w:r>
     </w:p>
@@ -4325,6 +4421,60 @@
           <w:sz w:val="21"/>
         </w:rPr>
         <w:t>Click Save. The Exposure Score is calculated automatically.</w:t>
+      </w:r>
+    </w:p>
+    <w:p>
+      <w:pPr>
+        <w:spacing w:before="160" w:after="0"/>
+        <w:jc w:val="center"/>
+      </w:pPr>
+      <w:r>
+        <w:drawing>
+          <wp:inline xmlns:a="http://schemas.openxmlformats.org/drawingml/2006/main" xmlns:pic="http://schemas.openxmlformats.org/drawingml/2006/picture">
+            <wp:extent cx="5760720" cy="3240405"/>
+            <wp:docPr id="8" name="Picture 8"/>
+            <wp:cNvGraphicFramePr>
+              <a:graphicFrameLocks noChangeAspect="1"/>
+            </wp:cNvGraphicFramePr>
+            <a:graphic>
+              <a:graphicData uri="http://schemas.openxmlformats.org/drawingml/2006/picture">
+                <pic:pic>
+                  <pic:nvPicPr>
+                    <pic:cNvPr id="0" name="13_add_raid_flyout.png"/>
+                    <pic:cNvPicPr/>
+                  </pic:nvPicPr>
+                  <pic:blipFill>
+                    <a:blip r:embed="rId17"/>
+                    <a:stretch>
+                      <a:fillRect/>
+                    </a:stretch>
+                  </pic:blipFill>
+                  <pic:spPr>
+                    <a:xfrm>
+                      <a:off x="0" y="0"/>
+                      <a:ext cx="5760720" cy="3240405"/>
+                    </a:xfrm>
+                    <a:prstGeom prst="rect"/>
+                  </pic:spPr>
+                </pic:pic>
+              </a:graphicData>
+            </a:graphic>
+          </wp:inline>
+        </w:drawing>
+      </w:r>
+    </w:p>
+    <w:p>
+      <w:pPr>
+        <w:spacing w:before="80" w:after="280"/>
+        <w:jc w:val="center"/>
+      </w:pPr>
+      <w:r>
+        <w:rPr>
+          <w:i/>
+          <w:color w:val="6C757D"/>
+          <w:sz w:val="18"/>
+        </w:rPr>
+        <w:t>Figure 7.2 — Logging/Editing a RAID item with mitigation strategy, owner select, and auto-exposure calculation.</w:t>
       </w:r>
     </w:p>
     <w:p/>
@@ -4720,7 +4870,7 @@
         <w:drawing>
           <wp:inline xmlns:a="http://schemas.openxmlformats.org/drawingml/2006/main" xmlns:pic="http://schemas.openxmlformats.org/drawingml/2006/picture">
             <wp:extent cx="5760720" cy="3240405"/>
-            <wp:docPr id="6" name="Picture 6"/>
+            <wp:docPr id="9" name="Picture 9"/>
             <wp:cNvGraphicFramePr>
               <a:graphicFrameLocks noChangeAspect="1"/>
             </wp:cNvGraphicFramePr>
@@ -4732,7 +4882,7 @@
                     <pic:cNvPicPr/>
                   </pic:nvPicPr>
                   <pic:blipFill>
-                    <a:blip r:embed="rId15"/>
+                    <a:blip r:embed="rId18"/>
                     <a:stretch>
                       <a:fillRect/>
                     </a:stretch>
@@ -4825,192 +4975,6 @@
         <w:t>Click Save. The member now appears in all assignee dropdowns and the Scheduler heatmap.</w:t>
       </w:r>
     </w:p>
-    <w:p/>
-    <w:p>
-      <w:pPr>
-        <w:pStyle w:val="Heading2"/>
-        <w:spacing w:before="360" w:after="120"/>
-      </w:pPr>
-      <w:r>
-        <w:rPr>
-          <w:color w:val="1E9ED5"/>
-        </w:rPr>
-        <w:t>8.2  Recording Planned Leave</w:t>
-      </w:r>
-    </w:p>
-    <w:p>
-      <w:pPr>
-        <w:pStyle w:val="ListNumber"/>
-        <w:spacing w:before="0" w:after="60"/>
-      </w:pPr>
-      <w:r>
-        <w:rPr>
-          <w:sz w:val="21"/>
-        </w:rPr>
-        <w:t>Click on a team member's card to open their profile.</w:t>
-      </w:r>
-    </w:p>
-    <w:p>
-      <w:pPr>
-        <w:pStyle w:val="ListNumber"/>
-        <w:spacing w:before="0" w:after="60"/>
-      </w:pPr>
-      <w:r>
-        <w:rPr>
-          <w:sz w:val="21"/>
-        </w:rPr>
-        <w:t>Click '+ Add Leave' in the Leave Calendar section.</w:t>
-      </w:r>
-    </w:p>
-    <w:p>
-      <w:pPr>
-        <w:pStyle w:val="ListNumber"/>
-        <w:spacing w:before="0" w:after="60"/>
-      </w:pPr>
-      <w:r>
-        <w:rPr>
-          <w:sz w:val="21"/>
-        </w:rPr>
-        <w:t>Select the leave start date and end date.</w:t>
-      </w:r>
-    </w:p>
-    <w:p>
-      <w:pPr>
-        <w:pStyle w:val="ListNumber"/>
-        <w:spacing w:before="0" w:after="60"/>
-      </w:pPr>
-      <w:r>
-        <w:rPr>
-          <w:sz w:val="21"/>
-        </w:rPr>
-        <w:t>Click Save. The Scheduler will show the member's cells for that period as 'On Leave' (grey, zero capacity).</w:t>
-      </w:r>
-    </w:p>
-    <w:p/>
-    <w:p>
-      <w:pPr>
-        <w:pStyle w:val="Heading2"/>
-        <w:spacing w:before="360" w:after="120"/>
-      </w:pPr>
-      <w:r>
-        <w:rPr>
-          <w:color w:val="1E9ED5"/>
-        </w:rPr>
-        <w:t>8.3  Member Status Management</w:t>
-      </w:r>
-    </w:p>
-    <w:p>
-      <w:pPr>
-        <w:spacing w:before="0" w:after="80"/>
-      </w:pPr>
-      <w:r>
-        <w:rPr>
-          <w:sz w:val="21"/>
-        </w:rPr>
-        <w:t>Updating a member's status affects their availability across all scheduling calculations:</w:t>
-      </w:r>
-    </w:p>
-    <w:p>
-      <w:pPr>
-        <w:pStyle w:val="ListBullet"/>
-        <w:spacing w:before="0" w:after="60"/>
-        <w:ind w:left="360"/>
-      </w:pPr>
-      <w:r>
-        <w:rPr>
-          <w:sz w:val="21"/>
-        </w:rPr>
-        <w:t>Active: Normal capacity available. Can be assigned to tasks.</w:t>
-      </w:r>
-    </w:p>
-    <w:p>
-      <w:pPr>
-        <w:pStyle w:val="ListBullet"/>
-        <w:spacing w:before="0" w:after="60"/>
-        <w:ind w:left="360"/>
-      </w:pPr>
-      <w:r>
-        <w:rPr>
-          <w:sz w:val="21"/>
-        </w:rPr>
-        <w:t>On Leave: Zero capacity for leave period. Scheduler shows grey cells.</w:t>
-      </w:r>
-    </w:p>
-    <w:p>
-      <w:pPr>
-        <w:pStyle w:val="ListBullet"/>
-        <w:spacing w:before="0" w:after="60"/>
-        <w:ind w:left="360"/>
-      </w:pPr>
-      <w:r>
-        <w:rPr>
-          <w:sz w:val="21"/>
-        </w:rPr>
-        <w:t>Other Assignment: Temporarily excluded from capacity. Existing task assignments remain.</w:t>
-      </w:r>
-    </w:p>
-    <w:p>
-      <w:pPr>
-        <w:pStyle w:val="ListBullet"/>
-        <w:spacing w:before="0" w:after="60"/>
-        <w:ind w:left="360"/>
-      </w:pPr>
-      <w:r>
-        <w:rPr>
-          <w:sz w:val="21"/>
-        </w:rPr>
-        <w:t>Serving Notice Period: Cannot be assigned to new tasks. Copilot will not reassign work to them.</w:t>
-      </w:r>
-    </w:p>
-    <w:p>
-      <w:pPr>
-        <w:pStyle w:val="ListBullet"/>
-        <w:spacing w:before="0" w:after="60"/>
-        <w:ind w:left="360"/>
-      </w:pPr>
-      <w:r>
-        <w:rPr>
-          <w:sz w:val="21"/>
-        </w:rPr>
-        <w:t>Departed: Fully removed from capacity calculations. Existing assignments remain for record.</w:t>
-      </w:r>
-    </w:p>
-    <w:p>
-      <w:r>
-        <w:br w:type="page"/>
-      </w:r>
-    </w:p>
-    <w:p>
-      <w:pPr>
-        <w:pStyle w:val="Heading1"/>
-        <w:spacing w:before="360" w:after="120"/>
-      </w:pPr>
-      <w:r>
-        <w:rPr>
-          <w:color w:val="0D1B2A"/>
-        </w:rPr>
-        <w:t>Chapter 9 — Defect Tracker</w:t>
-      </w:r>
-    </w:p>
-    <w:p>
-      <w:pPr>
-        <w:pBdr>
-          <w:bottom w:val="single" w:sz="6" w:space="1" w:color="00C2A8"/>
-        </w:pBdr>
-        <w:spacing w:before="0" w:after="120"/>
-      </w:pPr>
-    </w:p>
-    <w:p>
-      <w:pPr>
-        <w:spacing w:before="0" w:after="160"/>
-      </w:pPr>
-      <w:r>
-        <w:rPr>
-          <w:sz w:val="21"/>
-        </w:rPr>
-        <w:t>The Defect Tracker manages all software defects from initial discovery through resolution and closure. Use it to ensure all bugs are tracked, assigned, and resolved within agreed SLA timeframes.</w:t>
-      </w:r>
-    </w:p>
     <w:p>
       <w:pPr>
         <w:spacing w:before="160" w:after="0"/>
@@ -5020,7 +4984,7 @@
         <w:drawing>
           <wp:inline xmlns:a="http://schemas.openxmlformats.org/drawingml/2006/main" xmlns:pic="http://schemas.openxmlformats.org/drawingml/2006/picture">
             <wp:extent cx="5760720" cy="3240405"/>
-            <wp:docPr id="7" name="Picture 7"/>
+            <wp:docPr id="10" name="Picture 10"/>
             <wp:cNvGraphicFramePr>
               <a:graphicFrameLocks noChangeAspect="1"/>
             </wp:cNvGraphicFramePr>
@@ -5028,11 +4992,11 @@
               <a:graphicData uri="http://schemas.openxmlformats.org/drawingml/2006/picture">
                 <pic:pic>
                   <pic:nvPicPr>
-                    <pic:cNvPr id="0" name="07_defect_tracker.png"/>
+                    <pic:cNvPr id="0" name="14_add_member_flyout.png"/>
                     <pic:cNvPicPr/>
                   </pic:nvPicPr>
                   <pic:blipFill>
-                    <a:blip r:embed="rId16"/>
+                    <a:blip r:embed="rId19"/>
                     <a:stretch>
                       <a:fillRect/>
                     </a:stretch>
@@ -5062,6 +5026,246 @@
           <w:color w:val="6C757D"/>
           <w:sz w:val="18"/>
         </w:rPr>
+        <w:t>Figure 8.2 — Add/Edit Team Member form showing capacity hour caps, utilization rates, and planned leaves scheduler.</w:t>
+      </w:r>
+    </w:p>
+    <w:p/>
+    <w:p>
+      <w:pPr>
+        <w:pStyle w:val="Heading2"/>
+        <w:spacing w:before="360" w:after="120"/>
+      </w:pPr>
+      <w:r>
+        <w:rPr>
+          <w:color w:val="1E9ED5"/>
+        </w:rPr>
+        <w:t>8.2  Recording Planned Leave</w:t>
+      </w:r>
+    </w:p>
+    <w:p>
+      <w:pPr>
+        <w:pStyle w:val="ListNumber"/>
+        <w:spacing w:before="0" w:after="60"/>
+      </w:pPr>
+      <w:r>
+        <w:rPr>
+          <w:sz w:val="21"/>
+        </w:rPr>
+        <w:t>Click on a team member's card to open their profile.</w:t>
+      </w:r>
+    </w:p>
+    <w:p>
+      <w:pPr>
+        <w:pStyle w:val="ListNumber"/>
+        <w:spacing w:before="0" w:after="60"/>
+      </w:pPr>
+      <w:r>
+        <w:rPr>
+          <w:sz w:val="21"/>
+        </w:rPr>
+        <w:t>Click '+ Add Leave' in the Leave Calendar section.</w:t>
+      </w:r>
+    </w:p>
+    <w:p>
+      <w:pPr>
+        <w:pStyle w:val="ListNumber"/>
+        <w:spacing w:before="0" w:after="60"/>
+      </w:pPr>
+      <w:r>
+        <w:rPr>
+          <w:sz w:val="21"/>
+        </w:rPr>
+        <w:t>Select the leave start date and end date.</w:t>
+      </w:r>
+    </w:p>
+    <w:p>
+      <w:pPr>
+        <w:pStyle w:val="ListNumber"/>
+        <w:spacing w:before="0" w:after="60"/>
+      </w:pPr>
+      <w:r>
+        <w:rPr>
+          <w:sz w:val="21"/>
+        </w:rPr>
+        <w:t>Click Save. The Scheduler will show the member's cells for that period as 'On Leave' (grey, zero capacity).</w:t>
+      </w:r>
+    </w:p>
+    <w:p/>
+    <w:p>
+      <w:pPr>
+        <w:pStyle w:val="Heading2"/>
+        <w:spacing w:before="360" w:after="120"/>
+      </w:pPr>
+      <w:r>
+        <w:rPr>
+          <w:color w:val="1E9ED5"/>
+        </w:rPr>
+        <w:t>8.3  Member Status Management</w:t>
+      </w:r>
+    </w:p>
+    <w:p>
+      <w:pPr>
+        <w:spacing w:before="0" w:after="80"/>
+      </w:pPr>
+      <w:r>
+        <w:rPr>
+          <w:sz w:val="21"/>
+        </w:rPr>
+        <w:t>Updating a member's status affects their availability across all scheduling calculations:</w:t>
+      </w:r>
+    </w:p>
+    <w:p>
+      <w:pPr>
+        <w:pStyle w:val="ListBullet"/>
+        <w:spacing w:before="0" w:after="60"/>
+        <w:ind w:left="360"/>
+      </w:pPr>
+      <w:r>
+        <w:rPr>
+          <w:sz w:val="21"/>
+        </w:rPr>
+        <w:t>Active: Normal capacity available. Can be assigned to tasks.</w:t>
+      </w:r>
+    </w:p>
+    <w:p>
+      <w:pPr>
+        <w:pStyle w:val="ListBullet"/>
+        <w:spacing w:before="0" w:after="60"/>
+        <w:ind w:left="360"/>
+      </w:pPr>
+      <w:r>
+        <w:rPr>
+          <w:sz w:val="21"/>
+        </w:rPr>
+        <w:t>On Leave: Zero capacity for leave period. Scheduler shows grey cells.</w:t>
+      </w:r>
+    </w:p>
+    <w:p>
+      <w:pPr>
+        <w:pStyle w:val="ListBullet"/>
+        <w:spacing w:before="0" w:after="60"/>
+        <w:ind w:left="360"/>
+      </w:pPr>
+      <w:r>
+        <w:rPr>
+          <w:sz w:val="21"/>
+        </w:rPr>
+        <w:t>Other Assignment: Temporarily excluded from capacity. Existing task assignments remain.</w:t>
+      </w:r>
+    </w:p>
+    <w:p>
+      <w:pPr>
+        <w:pStyle w:val="ListBullet"/>
+        <w:spacing w:before="0" w:after="60"/>
+        <w:ind w:left="360"/>
+      </w:pPr>
+      <w:r>
+        <w:rPr>
+          <w:sz w:val="21"/>
+        </w:rPr>
+        <w:t>Serving Notice Period: Cannot be assigned to new tasks. Copilot will not reassign work to them.</w:t>
+      </w:r>
+    </w:p>
+    <w:p>
+      <w:pPr>
+        <w:pStyle w:val="ListBullet"/>
+        <w:spacing w:before="0" w:after="60"/>
+        <w:ind w:left="360"/>
+      </w:pPr>
+      <w:r>
+        <w:rPr>
+          <w:sz w:val="21"/>
+        </w:rPr>
+        <w:t>Departed: Fully removed from capacity calculations. Existing assignments remain for record.</w:t>
+      </w:r>
+    </w:p>
+    <w:p>
+      <w:r>
+        <w:br w:type="page"/>
+      </w:r>
+    </w:p>
+    <w:p>
+      <w:pPr>
+        <w:pStyle w:val="Heading1"/>
+        <w:spacing w:before="360" w:after="120"/>
+      </w:pPr>
+      <w:r>
+        <w:rPr>
+          <w:color w:val="0D1B2A"/>
+        </w:rPr>
+        <w:t>Chapter 9 — Defect Tracker</w:t>
+      </w:r>
+    </w:p>
+    <w:p>
+      <w:pPr>
+        <w:pBdr>
+          <w:bottom w:val="single" w:sz="6" w:space="1" w:color="00C2A8"/>
+        </w:pBdr>
+        <w:spacing w:before="0" w:after="120"/>
+      </w:pPr>
+    </w:p>
+    <w:p>
+      <w:pPr>
+        <w:spacing w:before="0" w:after="160"/>
+      </w:pPr>
+      <w:r>
+        <w:rPr>
+          <w:sz w:val="21"/>
+        </w:rPr>
+        <w:t>The Defect Tracker manages all software defects from initial discovery through resolution and closure. Use it to ensure all bugs are tracked, assigned, and resolved within agreed SLA timeframes.</w:t>
+      </w:r>
+    </w:p>
+    <w:p>
+      <w:pPr>
+        <w:spacing w:before="160" w:after="0"/>
+        <w:jc w:val="center"/>
+      </w:pPr>
+      <w:r>
+        <w:drawing>
+          <wp:inline xmlns:a="http://schemas.openxmlformats.org/drawingml/2006/main" xmlns:pic="http://schemas.openxmlformats.org/drawingml/2006/picture">
+            <wp:extent cx="5760720" cy="3240405"/>
+            <wp:docPr id="11" name="Picture 11"/>
+            <wp:cNvGraphicFramePr>
+              <a:graphicFrameLocks noChangeAspect="1"/>
+            </wp:cNvGraphicFramePr>
+            <a:graphic>
+              <a:graphicData uri="http://schemas.openxmlformats.org/drawingml/2006/picture">
+                <pic:pic>
+                  <pic:nvPicPr>
+                    <pic:cNvPr id="0" name="07_defect_tracker.png"/>
+                    <pic:cNvPicPr/>
+                  </pic:nvPicPr>
+                  <pic:blipFill>
+                    <a:blip r:embed="rId20"/>
+                    <a:stretch>
+                      <a:fillRect/>
+                    </a:stretch>
+                  </pic:blipFill>
+                  <pic:spPr>
+                    <a:xfrm>
+                      <a:off x="0" y="0"/>
+                      <a:ext cx="5760720" cy="3240405"/>
+                    </a:xfrm>
+                    <a:prstGeom prst="rect"/>
+                  </pic:spPr>
+                </pic:pic>
+              </a:graphicData>
+            </a:graphic>
+          </wp:inline>
+        </w:drawing>
+      </w:r>
+    </w:p>
+    <w:p>
+      <w:pPr>
+        <w:spacing w:before="80" w:after="280"/>
+        <w:jc w:val="center"/>
+      </w:pPr>
+      <w:r>
+        <w:rPr>
+          <w:i/>
+          <w:color w:val="6C757D"/>
+          <w:sz w:val="18"/>
+        </w:rPr>
         <w:t>Figure 9.1 — The Defect Tracker showing severity summary cards, the defect register, and the log defect form.</w:t>
       </w:r>
     </w:p>
@@ -5171,6 +5375,60 @@
           <w:sz w:val="21"/>
         </w:rPr>
         <w:t>Click Save.</w:t>
+      </w:r>
+    </w:p>
+    <w:p>
+      <w:pPr>
+        <w:spacing w:before="160" w:after="0"/>
+        <w:jc w:val="center"/>
+      </w:pPr>
+      <w:r>
+        <w:drawing>
+          <wp:inline xmlns:a="http://schemas.openxmlformats.org/drawingml/2006/main" xmlns:pic="http://schemas.openxmlformats.org/drawingml/2006/picture">
+            <wp:extent cx="5760720" cy="3240405"/>
+            <wp:docPr id="12" name="Picture 12"/>
+            <wp:cNvGraphicFramePr>
+              <a:graphicFrameLocks noChangeAspect="1"/>
+            </wp:cNvGraphicFramePr>
+            <a:graphic>
+              <a:graphicData uri="http://schemas.openxmlformats.org/drawingml/2006/picture">
+                <pic:pic>
+                  <pic:nvPicPr>
+                    <pic:cNvPr id="0" name="12_add_defect_flyout.png"/>
+                    <pic:cNvPicPr/>
+                  </pic:nvPicPr>
+                  <pic:blipFill>
+                    <a:blip r:embed="rId21"/>
+                    <a:stretch>
+                      <a:fillRect/>
+                    </a:stretch>
+                  </pic:blipFill>
+                  <pic:spPr>
+                    <a:xfrm>
+                      <a:off x="0" y="0"/>
+                      <a:ext cx="5760720" cy="3240405"/>
+                    </a:xfrm>
+                    <a:prstGeom prst="rect"/>
+                  </pic:spPr>
+                </pic:pic>
+              </a:graphicData>
+            </a:graphic>
+          </wp:inline>
+        </w:drawing>
+      </w:r>
+    </w:p>
+    <w:p>
+      <w:pPr>
+        <w:spacing w:before="80" w:after="280"/>
+        <w:jc w:val="center"/>
+      </w:pPr>
+      <w:r>
+        <w:rPr>
+          <w:i/>
+          <w:color w:val="6C757D"/>
+          <w:sz w:val="18"/>
+        </w:rPr>
+        <w:t>Figure 9.2 — Log Defect form linking the bug to a parent task, specifying severity, and listing reproduction steps.</w:t>
       </w:r>
     </w:p>
     <w:p/>
@@ -5372,7 +5630,7 @@
         <w:drawing>
           <wp:inline xmlns:a="http://schemas.openxmlformats.org/drawingml/2006/main" xmlns:pic="http://schemas.openxmlformats.org/drawingml/2006/picture">
             <wp:extent cx="5760720" cy="3240405"/>
-            <wp:docPr id="8" name="Picture 8"/>
+            <wp:docPr id="13" name="Picture 13"/>
             <wp:cNvGraphicFramePr>
               <a:graphicFrameLocks noChangeAspect="1"/>
             </wp:cNvGraphicFramePr>
@@ -5384,7 +5642,7 @@
                     <pic:cNvPicPr/>
                   </pic:nvPicPr>
                   <pic:blipFill>
-                    <a:blip r:embed="rId17"/>
+                    <a:blip r:embed="rId22"/>
                     <a:stretch>
                       <a:fillRect/>
                     </a:stretch>
@@ -5648,7 +5906,7 @@
         <w:drawing>
           <wp:inline xmlns:a="http://schemas.openxmlformats.org/drawingml/2006/main" xmlns:pic="http://schemas.openxmlformats.org/drawingml/2006/picture">
             <wp:extent cx="5760720" cy="3240405"/>
-            <wp:docPr id="9" name="Picture 9"/>
+            <wp:docPr id="14" name="Picture 14"/>
             <wp:cNvGraphicFramePr>
               <a:graphicFrameLocks noChangeAspect="1"/>
             </wp:cNvGraphicFramePr>
@@ -5660,7 +5918,7 @@
                     <pic:cNvPicPr/>
                   </pic:nvPicPr>
                   <pic:blipFill>
-                    <a:blip r:embed="rId18"/>
+                    <a:blip r:embed="rId23"/>
                     <a:stretch>
                       <a:fillRect/>
                     </a:stretch>
@@ -5963,7 +6221,7 @@
         <w:drawing>
           <wp:inline xmlns:a="http://schemas.openxmlformats.org/drawingml/2006/main" xmlns:pic="http://schemas.openxmlformats.org/drawingml/2006/picture">
             <wp:extent cx="5760720" cy="3240405"/>
-            <wp:docPr id="10" name="Picture 10"/>
+            <wp:docPr id="15" name="Picture 15"/>
             <wp:cNvGraphicFramePr>
               <a:graphicFrameLocks noChangeAspect="1"/>
             </wp:cNvGraphicFramePr>
@@ -5975,7 +6233,7 @@
                     <pic:cNvPicPr/>
                   </pic:nvPicPr>
                   <pic:blipFill>
-                    <a:blip r:embed="rId19"/>
+                    <a:blip r:embed="rId24"/>
                     <a:stretch>
                       <a:fillRect/>
                     </a:stretch>

</xml_diff>

<commit_message>
docs: add detailed dashboard widget guide to UMI manual
</commit_message>
<xml_diff>
--- a/docs/ProjectPulse_User_Manual.docx
+++ b/docs/ProjectPulse_User_Manual.docx
@@ -1939,7 +1939,7 @@
         <w:rPr>
           <w:sz w:val="21"/>
         </w:rPr>
-        <w:t>The Overview Dashboard is your project's health command centre. It gives you an instant read on how your project is performing across four critical dimensions: schedule, risk, quality, and delivery confidence.</w:t>
+        <w:t>The Overview Dashboard is your project's health health command centre. It gives you an instant read on how your project is performing across four critical dimensions: schedule, risk, quality, and delivery confidence.</w:t>
       </w:r>
     </w:p>
     <w:p>
@@ -2537,6 +2537,245 @@
       </w:tr>
     </w:tbl>
     <w:p/>
+    <w:p>
+      <w:pPr>
+        <w:pStyle w:val="Heading2"/>
+        <w:spacing w:before="360" w:after="120"/>
+      </w:pPr>
+      <w:r>
+        <w:rPr>
+          <w:color w:val="1E9ED5"/>
+        </w:rPr>
+        <w:t>2.4  Interactive Dashboard Widgets Reference Guide</w:t>
+      </w:r>
+    </w:p>
+    <w:p>
+      <w:pPr>
+        <w:spacing w:before="0" w:after="160"/>
+      </w:pPr>
+      <w:r>
+        <w:rPr>
+          <w:sz w:val="21"/>
+        </w:rPr>
+        <w:t>ProjectPulse is built around an interactive, highly-customisable widget ecosystem. Each widget acts as an information radiator, providing transparency on specific metrics.</w:t>
+      </w:r>
+    </w:p>
+    <w:p>
+      <w:pPr>
+        <w:pStyle w:val="Heading3"/>
+        <w:spacing w:before="360" w:after="120"/>
+      </w:pPr>
+      <w:r>
+        <w:rPr>
+          <w:color w:val="0D1B2A"/>
+        </w:rPr>
+        <w:t>2.4.1  Schedule Pacing &amp; Milestones Widget</w:t>
+      </w:r>
+    </w:p>
+    <w:p>
+      <w:pPr>
+        <w:spacing w:before="0" w:after="120"/>
+      </w:pPr>
+      <w:r>
+        <w:rPr>
+          <w:sz w:val="21"/>
+        </w:rPr>
+        <w:t>• Purpose: Shows upcoming delivery demands and recently achieved milestones.</w:t>
+        <w:br/>
+        <w:t>• How to Read: Displays upcoming tasks due in 7, 14, and 30 days as badge counters. Red badges indicate immediate pressure, amber shows moderate volume, and green indicates a light schedule. A checklist below lists completed milestone tasks marked with green check circles.</w:t>
+        <w:br/>
+        <w:t>• Actionable Insight: If the 7-day badge is Red, ensure the assignee list is fully staffed and no team member has planned leaves.</w:t>
+      </w:r>
+    </w:p>
+    <w:p>
+      <w:pPr>
+        <w:pStyle w:val="Heading3"/>
+        <w:spacing w:before="360" w:after="120"/>
+      </w:pPr>
+      <w:r>
+        <w:rPr>
+          <w:color w:val="0D1B2A"/>
+        </w:rPr>
+        <w:t>2.4.2  High-Priority RAID Risks Widget</w:t>
+      </w:r>
+    </w:p>
+    <w:p>
+      <w:pPr>
+        <w:spacing w:before="0" w:after="120"/>
+      </w:pPr>
+      <w:r>
+        <w:rPr>
+          <w:sz w:val="21"/>
+        </w:rPr>
+        <w:t>• Purpose: Surface the most critical threats to project execution.</w:t>
+        <w:br/>
+        <w:t>• How to Read: Lists the top three active risks from the RAID register sorted by highest exposure score. Each risk shows its ID, title, impact level, and designated owner.</w:t>
+        <w:br/>
+        <w:t>• Actionable Insight: Assign owners immediately to any risk flagged with High impact to ensure mitigation activities are underway.</w:t>
+      </w:r>
+    </w:p>
+    <w:p>
+      <w:pPr>
+        <w:pStyle w:val="Heading3"/>
+        <w:spacing w:before="360" w:after="120"/>
+      </w:pPr>
+      <w:r>
+        <w:rPr>
+          <w:color w:val="0D1B2A"/>
+        </w:rPr>
+        <w:t>2.4.3  Strategic Module Status Matrix Widget</w:t>
+      </w:r>
+    </w:p>
+    <w:p>
+      <w:pPr>
+        <w:spacing w:before="0" w:after="120"/>
+      </w:pPr>
+      <w:r>
+        <w:rPr>
+          <w:sz w:val="21"/>
+        </w:rPr>
+        <w:t>• Purpose: Summarise software engineering progress across architectural modules.</w:t>
+        <w:br/>
+        <w:t>• How to Read: A grid displaying modules (e.g., Core Engine, API Gateway) on rows and statuses on columns. Numbers inside cells show the count of tasks, with a horizontal progress bar indicating completion percentage. Hovering over elements reveals release mappings.</w:t>
+        <w:br/>
+        <w:t>• Actionable Insight: Check for modules with 0% progress when close to their target release versions to prevent release slippage.</w:t>
+      </w:r>
+    </w:p>
+    <w:p>
+      <w:pPr>
+        <w:pStyle w:val="Heading3"/>
+        <w:spacing w:before="360" w:after="120"/>
+      </w:pPr>
+      <w:r>
+        <w:rPr>
+          <w:color w:val="0D1B2A"/>
+        </w:rPr>
+        <w:t>2.4.4  Team Capacity Allocation Widget</w:t>
+      </w:r>
+    </w:p>
+    <w:p>
+      <w:pPr>
+        <w:spacing w:before="0" w:after="120"/>
+      </w:pPr>
+      <w:r>
+        <w:rPr>
+          <w:sz w:val="21"/>
+        </w:rPr>
+        <w:t>• Purpose: Visualise the distribution of effort across roles and disciplines.</w:t>
+        <w:br/>
+        <w:t>• How to Read: Features a progress grid representing total planned hours allocated to each role (e.g., Lead Architect, QA, PM). Shows percentage bars indicating resource utilisation ratios.</w:t>
+        <w:br/>
+        <w:t>• Actionable Insight: A high QA utilization combined with low Developer progress implies QA resources are idle, suggesting tasks need sequencing adjustments.</w:t>
+      </w:r>
+    </w:p>
+    <w:p>
+      <w:pPr>
+        <w:pStyle w:val="Heading3"/>
+        <w:spacing w:before="360" w:after="120"/>
+      </w:pPr>
+      <w:r>
+        <w:rPr>
+          <w:color w:val="0D1B2A"/>
+        </w:rPr>
+        <w:t>2.4.5  High Impact Entities &amp; Overdue Attention Widget</w:t>
+      </w:r>
+    </w:p>
+    <w:p>
+      <w:pPr>
+        <w:spacing w:before="0" w:after="120"/>
+      </w:pPr>
+      <w:r>
+        <w:rPr>
+          <w:sz w:val="21"/>
+        </w:rPr>
+        <w:t>• Purpose: Identify tasks blocking downstream work or lagging past their deadlines.</w:t>
+        <w:br/>
+        <w:t>• How to Read: Lists critical path items with high follower counts, and overdue items. Red badges indicate tasks past their due date, while warning icons highlight blockers with multiple dependents.</w:t>
+        <w:br/>
+        <w:t>• Actionable Insight: Allocate senior developers to resolve overdue blocking tasks immediately to prevent compounding delays.</w:t>
+      </w:r>
+    </w:p>
+    <w:p>
+      <w:pPr>
+        <w:pStyle w:val="Heading3"/>
+        <w:spacing w:before="360" w:after="120"/>
+      </w:pPr>
+      <w:r>
+        <w:rPr>
+          <w:color w:val="0D1B2A"/>
+        </w:rPr>
+        <w:t>2.4.6  Defect Intelligence Bento Grid Widget</w:t>
+      </w:r>
+    </w:p>
+    <w:p>
+      <w:pPr>
+        <w:spacing w:before="0" w:after="120"/>
+      </w:pPr>
+      <w:r>
+        <w:rPr>
+          <w:sz w:val="21"/>
+        </w:rPr>
+        <w:t>• Purpose: Track product quality metrics and defect density.</w:t>
+        <w:br/>
+        <w:t>• How to Read: A collection of indicators presenting defects grouped by S1-S4 Severity (e.g. Blocker, High), priority distribution, and resolution rate (Closed vs. Open). Displays defect counts linked per code module.</w:t>
+        <w:br/>
+        <w:t>• Actionable Insight: An S1 Blocker count above zero triggers a high-severity red alert. QA testing should pause on that module until resolved.</w:t>
+      </w:r>
+    </w:p>
+    <w:p>
+      <w:pPr>
+        <w:pStyle w:val="Heading3"/>
+        <w:spacing w:before="360" w:after="120"/>
+      </w:pPr>
+      <w:r>
+        <w:rPr>
+          <w:color w:val="0D1B2A"/>
+        </w:rPr>
+        <w:t>2.4.7  Predictive Intelligence Widget</w:t>
+      </w:r>
+    </w:p>
+    <w:p>
+      <w:pPr>
+        <w:spacing w:before="0" w:after="120"/>
+      </w:pPr>
+      <w:r>
+        <w:rPr>
+          <w:sz w:val="21"/>
+        </w:rPr>
+        <w:t>• Purpose: Machine learning-driven forecast of final delivery timelines.</w:t>
+        <w:br/>
+        <w:t>• How to Read: Displays an estimated completion date and a risk factor score. Accounts for historically logged actual effort versus baseline schedules to project delays.</w:t>
+        <w:br/>
+        <w:t>• Actionable Insight: If the predictive completion date drifts past the project deadline, trigger a re-scoping exercise or utilize the Sandbox to model capacity shifts.</w:t>
+      </w:r>
+    </w:p>
+    <w:p>
+      <w:pPr>
+        <w:pStyle w:val="Heading3"/>
+        <w:spacing w:before="360" w:after="120"/>
+      </w:pPr>
+      <w:r>
+        <w:rPr>
+          <w:color w:val="0D1B2A"/>
+        </w:rPr>
+        <w:t>2.4.8  Advanced Analytics: Burn-up &amp; Velocity Widgets</w:t>
+      </w:r>
+    </w:p>
+    <w:p>
+      <w:pPr>
+        <w:spacing w:before="0" w:after="120"/>
+      </w:pPr>
+      <w:r>
+        <w:rPr>
+          <w:sz w:val="21"/>
+        </w:rPr>
+        <w:t>• Purpose: Monitor long-term pacing and team output.</w:t>
+        <w:br/>
+        <w:t>• How to Read: The Burn-up chart plots scope lines alongside completed hours. The Weekly Velocity widget shows a bar chart of effort completed week-over-week. The Cumulative Flow diagram highlights task volume by state over time.</w:t>
+        <w:br/>
+        <w:t>• Actionable Insight: Flat weekly velocity indicates operational bottlenecks or unlogged work, requiring status reviews.</w:t>
+      </w:r>
+    </w:p>
     <w:p>
       <w:r>
         <w:br w:type="page"/>

</xml_diff>

<commit_message>
docs: add global widget directory matrix (Chapter 14) covering all views
</commit_message>
<xml_diff>
--- a/docs/ProjectPulse_User_Manual.docx
+++ b/docs/ProjectPulse_User_Manual.docx
@@ -933,6 +933,56 @@
           </w:p>
         </w:tc>
       </w:tr>
+      <w:tr>
+        <w:tc>
+          <w:tcPr>
+            <w:tcW w:type="dxa" w:w="720"/>
+            <w:shd w:val="clear" w:color="auto" w:fill="FFFFFF"/>
+          </w:tcPr>
+          <w:p>
+            <w:r>
+              <w:rPr>
+                <w:b/>
+                <w:color w:val="00C2A8"/>
+                <w:sz w:val="20"/>
+              </w:rPr>
+              <w:t>14</w:t>
+            </w:r>
+          </w:p>
+        </w:tc>
+        <w:tc>
+          <w:tcPr>
+            <w:tcW w:type="dxa" w:w="7632"/>
+            <w:shd w:val="clear" w:color="auto" w:fill="FFFFFF"/>
+          </w:tcPr>
+          <w:p>
+            <w:r>
+              <w:rPr>
+                <w:sz w:val="21"/>
+              </w:rPr>
+              <w:t>Complete Widget Directory &amp; Glossary</w:t>
+            </w:r>
+          </w:p>
+        </w:tc>
+        <w:tc>
+          <w:tcPr>
+            <w:tcW w:type="dxa" w:w="864"/>
+            <w:shd w:val="clear" w:color="auto" w:fill="FFFFFF"/>
+          </w:tcPr>
+          <w:p>
+            <w:pPr>
+              <w:jc w:val="right"/>
+            </w:pPr>
+            <w:r>
+              <w:rPr>
+                <w:color w:val="6C757D"/>
+                <w:sz w:val="20"/>
+              </w:rPr>
+              <w:t>50</w:t>
+            </w:r>
+          </w:p>
+        </w:tc>
+      </w:tr>
     </w:tbl>
     <w:p>
       <w:r>
@@ -7723,6 +7773,3604 @@
       <w:pPr>
         <w:spacing w:after="120"/>
       </w:pPr>
+    </w:p>
+    <w:p>
+      <w:pPr>
+        <w:pStyle w:val="Heading1"/>
+        <w:spacing w:before="360" w:after="120"/>
+      </w:pPr>
+      <w:r>
+        <w:rPr>
+          <w:color w:val="0D1B2A"/>
+        </w:rPr>
+        <w:t>Chapter 14 — Complete Widget Directory &amp; Glossary</w:t>
+      </w:r>
+    </w:p>
+    <w:p>
+      <w:pPr>
+        <w:pBdr>
+          <w:bottom w:val="single" w:sz="6" w:space="1" w:color="00C2A8"/>
+        </w:pBdr>
+        <w:spacing w:before="0" w:after="120"/>
+      </w:pPr>
+    </w:p>
+    <w:p>
+      <w:pPr>
+        <w:spacing w:before="0" w:after="160"/>
+      </w:pPr>
+      <w:r>
+        <w:rPr>
+          <w:sz w:val="21"/>
+        </w:rPr>
+        <w:t>ProjectPulse uses a highly modular component architecture across its interactive views. This chapter lists every widget available in the Dashboard and Report Builder layouts, explaining their indicators, calculation mechanisms, and target audiences.</w:t>
+      </w:r>
+    </w:p>
+    <w:p>
+      <w:pPr>
+        <w:pStyle w:val="Heading2"/>
+        <w:spacing w:before="360" w:after="120"/>
+      </w:pPr>
+      <w:r>
+        <w:rPr>
+          <w:color w:val="1E9ED5"/>
+        </w:rPr>
+        <w:t>14.1  Global Widget Directory Matrix</w:t>
+      </w:r>
+    </w:p>
+    <w:tbl>
+      <w:tblPr>
+        <w:tblStyle w:val="TableGrid"/>
+        <w:tblW w:type="auto" w:w="0"/>
+        <w:jc w:val="center"/>
+        <w:tblLook w:firstColumn="1" w:firstRow="1" w:lastColumn="0" w:lastRow="0" w:noHBand="0" w:noVBand="1" w:val="04A0"/>
+      </w:tblPr>
+      <w:tblGrid>
+        <w:gridCol w:w="1814"/>
+        <w:gridCol w:w="1814"/>
+        <w:gridCol w:w="1814"/>
+        <w:gridCol w:w="1814"/>
+        <w:gridCol w:w="1814"/>
+      </w:tblGrid>
+      <w:tr>
+        <w:tc>
+          <w:tcPr>
+            <w:tcW w:type="dxa" w:w="1872"/>
+            <w:shd w:val="clear" w:color="auto" w:fill="0D1B2A"/>
+          </w:tcPr>
+          <w:p>
+            <w:pPr>
+              <w:jc w:val="center"/>
+            </w:pPr>
+            <w:r>
+              <w:rPr>
+                <w:b/>
+                <w:color w:val="FFFFFF"/>
+                <w:sz w:val="19"/>
+              </w:rPr>
+              <w:t>Widget ID</w:t>
+            </w:r>
+          </w:p>
+        </w:tc>
+        <w:tc>
+          <w:tcPr>
+            <w:tcW w:type="dxa" w:w="2592"/>
+            <w:shd w:val="clear" w:color="auto" w:fill="0D1B2A"/>
+          </w:tcPr>
+          <w:p>
+            <w:pPr>
+              <w:jc w:val="center"/>
+            </w:pPr>
+            <w:r>
+              <w:rPr>
+                <w:b/>
+                <w:color w:val="FFFFFF"/>
+                <w:sz w:val="19"/>
+              </w:rPr>
+              <w:t>Human-Readable Name</w:t>
+            </w:r>
+          </w:p>
+        </w:tc>
+        <w:tc>
+          <w:tcPr>
+            <w:tcW w:type="dxa" w:w="2016"/>
+            <w:shd w:val="clear" w:color="auto" w:fill="0D1B2A"/>
+          </w:tcPr>
+          <w:p>
+            <w:pPr>
+              <w:jc w:val="center"/>
+            </w:pPr>
+            <w:r>
+              <w:rPr>
+                <w:b/>
+                <w:color w:val="FFFFFF"/>
+                <w:sz w:val="19"/>
+              </w:rPr>
+              <w:t>Target View(s)</w:t>
+            </w:r>
+          </w:p>
+        </w:tc>
+        <w:tc>
+          <w:tcPr>
+            <w:tcW w:type="dxa" w:w="1296"/>
+            <w:shd w:val="clear" w:color="auto" w:fill="0D1B2A"/>
+          </w:tcPr>
+          <w:p>
+            <w:pPr>
+              <w:jc w:val="center"/>
+            </w:pPr>
+            <w:r>
+              <w:rPr>
+                <w:b/>
+                <w:color w:val="FFFFFF"/>
+                <w:sz w:val="19"/>
+              </w:rPr>
+              <w:t>Type</w:t>
+            </w:r>
+          </w:p>
+        </w:tc>
+        <w:tc>
+          <w:tcPr>
+            <w:tcW w:type="dxa" w:w="2304"/>
+            <w:shd w:val="clear" w:color="auto" w:fill="0D1B2A"/>
+          </w:tcPr>
+          <w:p>
+            <w:pPr>
+              <w:jc w:val="center"/>
+            </w:pPr>
+            <w:r>
+              <w:rPr>
+                <w:b/>
+                <w:color w:val="FFFFFF"/>
+                <w:sz w:val="19"/>
+              </w:rPr>
+              <w:t>Core Data Source</w:t>
+            </w:r>
+          </w:p>
+        </w:tc>
+      </w:tr>
+      <w:tr>
+        <w:tc>
+          <w:tcPr>
+            <w:tcW w:type="dxa" w:w="1872"/>
+            <w:shd w:val="clear" w:color="auto" w:fill="F8F9FA"/>
+          </w:tcPr>
+          <w:p>
+            <w:pPr>
+              <w:spacing w:before="60" w:after="60"/>
+            </w:pPr>
+            <w:r>
+              <w:rPr>
+                <w:sz w:val="19"/>
+              </w:rPr>
+              <w:t>summary</w:t>
+            </w:r>
+          </w:p>
+        </w:tc>
+        <w:tc>
+          <w:tcPr>
+            <w:tcW w:type="dxa" w:w="2592"/>
+            <w:shd w:val="clear" w:color="auto" w:fill="F8F9FA"/>
+          </w:tcPr>
+          <w:p>
+            <w:pPr>
+              <w:spacing w:before="60" w:after="60"/>
+            </w:pPr>
+            <w:r>
+              <w:rPr>
+                <w:sz w:val="19"/>
+              </w:rPr>
+              <w:t>Executive Summary</w:t>
+            </w:r>
+          </w:p>
+        </w:tc>
+        <w:tc>
+          <w:tcPr>
+            <w:tcW w:type="dxa" w:w="2016"/>
+            <w:shd w:val="clear" w:color="auto" w:fill="F8F9FA"/>
+          </w:tcPr>
+          <w:p>
+            <w:pPr>
+              <w:spacing w:before="60" w:after="60"/>
+            </w:pPr>
+            <w:r>
+              <w:rPr>
+                <w:sz w:val="19"/>
+              </w:rPr>
+              <w:t>Dashboard / Report</w:t>
+            </w:r>
+          </w:p>
+        </w:tc>
+        <w:tc>
+          <w:tcPr>
+            <w:tcW w:type="dxa" w:w="1296"/>
+            <w:shd w:val="clear" w:color="auto" w:fill="F8F9FA"/>
+          </w:tcPr>
+          <w:p>
+            <w:pPr>
+              <w:spacing w:before="60" w:after="60"/>
+            </w:pPr>
+            <w:r>
+              <w:rPr>
+                <w:sz w:val="19"/>
+              </w:rPr>
+              <w:t>Metrics Cards</w:t>
+            </w:r>
+          </w:p>
+        </w:tc>
+        <w:tc>
+          <w:tcPr>
+            <w:tcW w:type="dxa" w:w="2304"/>
+            <w:shd w:val="clear" w:color="auto" w:fill="F8F9FA"/>
+          </w:tcPr>
+          <w:p>
+            <w:pPr>
+              <w:spacing w:before="60" w:after="60"/>
+            </w:pPr>
+            <w:r>
+              <w:rPr>
+                <w:sz w:val="19"/>
+              </w:rPr>
+              <w:t>Task status, RAID count</w:t>
+            </w:r>
+          </w:p>
+        </w:tc>
+      </w:tr>
+      <w:tr>
+        <w:tc>
+          <w:tcPr>
+            <w:tcW w:type="dxa" w:w="1872"/>
+            <w:shd w:val="clear" w:color="auto" w:fill="FFFFFF"/>
+          </w:tcPr>
+          <w:p>
+            <w:pPr>
+              <w:spacing w:before="60" w:after="60"/>
+            </w:pPr>
+            <w:r>
+              <w:rPr>
+                <w:sz w:val="19"/>
+              </w:rPr>
+              <w:t>health</w:t>
+            </w:r>
+          </w:p>
+        </w:tc>
+        <w:tc>
+          <w:tcPr>
+            <w:tcW w:type="dxa" w:w="2592"/>
+            <w:shd w:val="clear" w:color="auto" w:fill="FFFFFF"/>
+          </w:tcPr>
+          <w:p>
+            <w:pPr>
+              <w:spacing w:before="60" w:after="60"/>
+            </w:pPr>
+            <w:r>
+              <w:rPr>
+                <w:sz w:val="19"/>
+              </w:rPr>
+              <w:t>Project Health &amp; Quality</w:t>
+            </w:r>
+          </w:p>
+        </w:tc>
+        <w:tc>
+          <w:tcPr>
+            <w:tcW w:type="dxa" w:w="2016"/>
+            <w:shd w:val="clear" w:color="auto" w:fill="FFFFFF"/>
+          </w:tcPr>
+          <w:p>
+            <w:pPr>
+              <w:spacing w:before="60" w:after="60"/>
+            </w:pPr>
+            <w:r>
+              <w:rPr>
+                <w:sz w:val="19"/>
+              </w:rPr>
+              <w:t>Dashboard / Report</w:t>
+            </w:r>
+          </w:p>
+        </w:tc>
+        <w:tc>
+          <w:tcPr>
+            <w:tcW w:type="dxa" w:w="1296"/>
+            <w:shd w:val="clear" w:color="auto" w:fill="FFFFFF"/>
+          </w:tcPr>
+          <w:p>
+            <w:pPr>
+              <w:spacing w:before="60" w:after="60"/>
+            </w:pPr>
+            <w:r>
+              <w:rPr>
+                <w:sz w:val="19"/>
+              </w:rPr>
+              <w:t>Charts</w:t>
+            </w:r>
+          </w:p>
+        </w:tc>
+        <w:tc>
+          <w:tcPr>
+            <w:tcW w:type="dxa" w:w="2304"/>
+            <w:shd w:val="clear" w:color="auto" w:fill="FFFFFF"/>
+          </w:tcPr>
+          <w:p>
+            <w:pPr>
+              <w:spacing w:before="60" w:after="60"/>
+            </w:pPr>
+            <w:r>
+              <w:rPr>
+                <w:sz w:val="19"/>
+              </w:rPr>
+              <w:t>Active vs overdue tasks</w:t>
+            </w:r>
+          </w:p>
+        </w:tc>
+      </w:tr>
+      <w:tr>
+        <w:tc>
+          <w:tcPr>
+            <w:tcW w:type="dxa" w:w="1872"/>
+            <w:shd w:val="clear" w:color="auto" w:fill="F8F9FA"/>
+          </w:tcPr>
+          <w:p>
+            <w:pPr>
+              <w:spacing w:before="60" w:after="60"/>
+            </w:pPr>
+            <w:r>
+              <w:rPr>
+                <w:sz w:val="19"/>
+              </w:rPr>
+              <w:t>mgmt_insights</w:t>
+            </w:r>
+          </w:p>
+        </w:tc>
+        <w:tc>
+          <w:tcPr>
+            <w:tcW w:type="dxa" w:w="2592"/>
+            <w:shd w:val="clear" w:color="auto" w:fill="F8F9FA"/>
+          </w:tcPr>
+          <w:p>
+            <w:pPr>
+              <w:spacing w:before="60" w:after="60"/>
+            </w:pPr>
+            <w:r>
+              <w:rPr>
+                <w:sz w:val="19"/>
+              </w:rPr>
+              <w:t>Management Insights</w:t>
+            </w:r>
+          </w:p>
+        </w:tc>
+        <w:tc>
+          <w:tcPr>
+            <w:tcW w:type="dxa" w:w="2016"/>
+            <w:shd w:val="clear" w:color="auto" w:fill="F8F9FA"/>
+          </w:tcPr>
+          <w:p>
+            <w:pPr>
+              <w:spacing w:before="60" w:after="60"/>
+            </w:pPr>
+            <w:r>
+              <w:rPr>
+                <w:sz w:val="19"/>
+              </w:rPr>
+              <w:t>Dashboard</w:t>
+            </w:r>
+          </w:p>
+        </w:tc>
+        <w:tc>
+          <w:tcPr>
+            <w:tcW w:type="dxa" w:w="1296"/>
+            <w:shd w:val="clear" w:color="auto" w:fill="F8F9FA"/>
+          </w:tcPr>
+          <w:p>
+            <w:pPr>
+              <w:spacing w:before="60" w:after="60"/>
+            </w:pPr>
+            <w:r>
+              <w:rPr>
+                <w:sz w:val="19"/>
+              </w:rPr>
+              <w:t>Multi-Card</w:t>
+            </w:r>
+          </w:p>
+        </w:tc>
+        <w:tc>
+          <w:tcPr>
+            <w:tcW w:type="dxa" w:w="2304"/>
+            <w:shd w:val="clear" w:color="auto" w:fill="F8F9FA"/>
+          </w:tcPr>
+          <w:p>
+            <w:pPr>
+              <w:spacing w:before="60" w:after="60"/>
+            </w:pPr>
+            <w:r>
+              <w:rPr>
+                <w:sz w:val="19"/>
+              </w:rPr>
+              <w:t>Pacing, risks, workloads</w:t>
+            </w:r>
+          </w:p>
+        </w:tc>
+      </w:tr>
+      <w:tr>
+        <w:tc>
+          <w:tcPr>
+            <w:tcW w:type="dxa" w:w="1872"/>
+            <w:shd w:val="clear" w:color="auto" w:fill="FFFFFF"/>
+          </w:tcPr>
+          <w:p>
+            <w:pPr>
+              <w:spacing w:before="60" w:after="60"/>
+            </w:pPr>
+            <w:r>
+              <w:rPr>
+                <w:sz w:val="19"/>
+              </w:rPr>
+              <w:t>exec_reporting</w:t>
+            </w:r>
+          </w:p>
+        </w:tc>
+        <w:tc>
+          <w:tcPr>
+            <w:tcW w:type="dxa" w:w="2592"/>
+            <w:shd w:val="clear" w:color="auto" w:fill="FFFFFF"/>
+          </w:tcPr>
+          <w:p>
+            <w:pPr>
+              <w:spacing w:before="60" w:after="60"/>
+            </w:pPr>
+            <w:r>
+              <w:rPr>
+                <w:sz w:val="19"/>
+              </w:rPr>
+              <w:t>Executive Reporting</w:t>
+            </w:r>
+          </w:p>
+        </w:tc>
+        <w:tc>
+          <w:tcPr>
+            <w:tcW w:type="dxa" w:w="2016"/>
+            <w:shd w:val="clear" w:color="auto" w:fill="FFFFFF"/>
+          </w:tcPr>
+          <w:p>
+            <w:pPr>
+              <w:spacing w:before="60" w:after="60"/>
+            </w:pPr>
+            <w:r>
+              <w:rPr>
+                <w:sz w:val="19"/>
+              </w:rPr>
+              <w:t>Dashboard</w:t>
+            </w:r>
+          </w:p>
+        </w:tc>
+        <w:tc>
+          <w:tcPr>
+            <w:tcW w:type="dxa" w:w="1296"/>
+            <w:shd w:val="clear" w:color="auto" w:fill="FFFFFF"/>
+          </w:tcPr>
+          <w:p>
+            <w:pPr>
+              <w:spacing w:before="60" w:after="60"/>
+            </w:pPr>
+            <w:r>
+              <w:rPr>
+                <w:sz w:val="19"/>
+              </w:rPr>
+              <w:t>Multi-Card</w:t>
+            </w:r>
+          </w:p>
+        </w:tc>
+        <w:tc>
+          <w:tcPr>
+            <w:tcW w:type="dxa" w:w="2304"/>
+            <w:shd w:val="clear" w:color="auto" w:fill="FFFFFF"/>
+          </w:tcPr>
+          <w:p>
+            <w:pPr>
+              <w:spacing w:before="60" w:after="60"/>
+            </w:pPr>
+            <w:r>
+              <w:rPr>
+                <w:sz w:val="19"/>
+              </w:rPr>
+              <w:t>Milestones &amp; critical items</w:t>
+            </w:r>
+          </w:p>
+        </w:tc>
+      </w:tr>
+      <w:tr>
+        <w:tc>
+          <w:tcPr>
+            <w:tcW w:type="dxa" w:w="1872"/>
+            <w:shd w:val="clear" w:color="auto" w:fill="F8F9FA"/>
+          </w:tcPr>
+          <w:p>
+            <w:pPr>
+              <w:spacing w:before="60" w:after="60"/>
+            </w:pPr>
+            <w:r>
+              <w:rPr>
+                <w:sz w:val="19"/>
+              </w:rPr>
+              <w:t>exec_capacity</w:t>
+            </w:r>
+          </w:p>
+        </w:tc>
+        <w:tc>
+          <w:tcPr>
+            <w:tcW w:type="dxa" w:w="2592"/>
+            <w:shd w:val="clear" w:color="auto" w:fill="F8F9FA"/>
+          </w:tcPr>
+          <w:p>
+            <w:pPr>
+              <w:spacing w:before="60" w:after="60"/>
+            </w:pPr>
+            <w:r>
+              <w:rPr>
+                <w:sz w:val="19"/>
+              </w:rPr>
+              <w:t>Team Capacity Allocation</w:t>
+            </w:r>
+          </w:p>
+        </w:tc>
+        <w:tc>
+          <w:tcPr>
+            <w:tcW w:type="dxa" w:w="2016"/>
+            <w:shd w:val="clear" w:color="auto" w:fill="F8F9FA"/>
+          </w:tcPr>
+          <w:p>
+            <w:pPr>
+              <w:spacing w:before="60" w:after="60"/>
+            </w:pPr>
+            <w:r>
+              <w:rPr>
+                <w:sz w:val="19"/>
+              </w:rPr>
+              <w:t>Dashboard / Report</w:t>
+            </w:r>
+          </w:p>
+        </w:tc>
+        <w:tc>
+          <w:tcPr>
+            <w:tcW w:type="dxa" w:w="1296"/>
+            <w:shd w:val="clear" w:color="auto" w:fill="F8F9FA"/>
+          </w:tcPr>
+          <w:p>
+            <w:pPr>
+              <w:spacing w:before="60" w:after="60"/>
+            </w:pPr>
+            <w:r>
+              <w:rPr>
+                <w:sz w:val="19"/>
+              </w:rPr>
+              <w:t>Grid / Heatmap</w:t>
+            </w:r>
+          </w:p>
+        </w:tc>
+        <w:tc>
+          <w:tcPr>
+            <w:tcW w:type="dxa" w:w="2304"/>
+            <w:shd w:val="clear" w:color="auto" w:fill="F8F9FA"/>
+          </w:tcPr>
+          <w:p>
+            <w:pPr>
+              <w:spacing w:before="60" w:after="60"/>
+            </w:pPr>
+            <w:r>
+              <w:rPr>
+                <w:sz w:val="19"/>
+              </w:rPr>
+              <w:t>Member weekly caps</w:t>
+            </w:r>
+          </w:p>
+        </w:tc>
+      </w:tr>
+      <w:tr>
+        <w:tc>
+          <w:tcPr>
+            <w:tcW w:type="dxa" w:w="1872"/>
+            <w:shd w:val="clear" w:color="auto" w:fill="FFFFFF"/>
+          </w:tcPr>
+          <w:p>
+            <w:pPr>
+              <w:spacing w:before="60" w:after="60"/>
+            </w:pPr>
+            <w:r>
+              <w:rPr>
+                <w:sz w:val="19"/>
+              </w:rPr>
+              <w:t>module_matrix</w:t>
+            </w:r>
+          </w:p>
+        </w:tc>
+        <w:tc>
+          <w:tcPr>
+            <w:tcW w:type="dxa" w:w="2592"/>
+            <w:shd w:val="clear" w:color="auto" w:fill="FFFFFF"/>
+          </w:tcPr>
+          <w:p>
+            <w:pPr>
+              <w:spacing w:before="60" w:after="60"/>
+            </w:pPr>
+            <w:r>
+              <w:rPr>
+                <w:sz w:val="19"/>
+              </w:rPr>
+              <w:t>Strategic Module Status</w:t>
+            </w:r>
+          </w:p>
+        </w:tc>
+        <w:tc>
+          <w:tcPr>
+            <w:tcW w:type="dxa" w:w="2016"/>
+            <w:shd w:val="clear" w:color="auto" w:fill="FFFFFF"/>
+          </w:tcPr>
+          <w:p>
+            <w:pPr>
+              <w:spacing w:before="60" w:after="60"/>
+            </w:pPr>
+            <w:r>
+              <w:rPr>
+                <w:sz w:val="19"/>
+              </w:rPr>
+              <w:t>Dashboard / Report</w:t>
+            </w:r>
+          </w:p>
+        </w:tc>
+        <w:tc>
+          <w:tcPr>
+            <w:tcW w:type="dxa" w:w="1296"/>
+            <w:shd w:val="clear" w:color="auto" w:fill="FFFFFF"/>
+          </w:tcPr>
+          <w:p>
+            <w:pPr>
+              <w:spacing w:before="60" w:after="60"/>
+            </w:pPr>
+            <w:r>
+              <w:rPr>
+                <w:sz w:val="19"/>
+              </w:rPr>
+              <w:t>Matrix Grid</w:t>
+            </w:r>
+          </w:p>
+        </w:tc>
+        <w:tc>
+          <w:tcPr>
+            <w:tcW w:type="dxa" w:w="2304"/>
+            <w:shd w:val="clear" w:color="auto" w:fill="FFFFFF"/>
+          </w:tcPr>
+          <w:p>
+            <w:pPr>
+              <w:spacing w:before="60" w:after="60"/>
+            </w:pPr>
+            <w:r>
+              <w:rPr>
+                <w:sz w:val="19"/>
+              </w:rPr>
+              <w:t>Task counts per module</w:t>
+            </w:r>
+          </w:p>
+        </w:tc>
+      </w:tr>
+      <w:tr>
+        <w:tc>
+          <w:tcPr>
+            <w:tcW w:type="dxa" w:w="1872"/>
+            <w:shd w:val="clear" w:color="auto" w:fill="F8F9FA"/>
+          </w:tcPr>
+          <w:p>
+            <w:pPr>
+              <w:spacing w:before="60" w:after="60"/>
+            </w:pPr>
+            <w:r>
+              <w:rPr>
+                <w:sz w:val="19"/>
+              </w:rPr>
+              <w:t>module_health</w:t>
+            </w:r>
+          </w:p>
+        </w:tc>
+        <w:tc>
+          <w:tcPr>
+            <w:tcW w:type="dxa" w:w="2592"/>
+            <w:shd w:val="clear" w:color="auto" w:fill="F8F9FA"/>
+          </w:tcPr>
+          <w:p>
+            <w:pPr>
+              <w:spacing w:before="60" w:after="60"/>
+            </w:pPr>
+            <w:r>
+              <w:rPr>
+                <w:sz w:val="19"/>
+              </w:rPr>
+              <w:t>Module &amp; Release Health</w:t>
+            </w:r>
+          </w:p>
+        </w:tc>
+        <w:tc>
+          <w:tcPr>
+            <w:tcW w:type="dxa" w:w="2016"/>
+            <w:shd w:val="clear" w:color="auto" w:fill="F8F9FA"/>
+          </w:tcPr>
+          <w:p>
+            <w:pPr>
+              <w:spacing w:before="60" w:after="60"/>
+            </w:pPr>
+            <w:r>
+              <w:rPr>
+                <w:sz w:val="19"/>
+              </w:rPr>
+              <w:t>Dashboard / Report</w:t>
+            </w:r>
+          </w:p>
+        </w:tc>
+        <w:tc>
+          <w:tcPr>
+            <w:tcW w:type="dxa" w:w="1296"/>
+            <w:shd w:val="clear" w:color="auto" w:fill="F8F9FA"/>
+          </w:tcPr>
+          <w:p>
+            <w:pPr>
+              <w:spacing w:before="60" w:after="60"/>
+            </w:pPr>
+            <w:r>
+              <w:rPr>
+                <w:sz w:val="19"/>
+              </w:rPr>
+              <w:t>Table</w:t>
+            </w:r>
+          </w:p>
+        </w:tc>
+        <w:tc>
+          <w:tcPr>
+            <w:tcW w:type="dxa" w:w="2304"/>
+            <w:shd w:val="clear" w:color="auto" w:fill="F8F9FA"/>
+          </w:tcPr>
+          <w:p>
+            <w:pPr>
+              <w:spacing w:before="60" w:after="60"/>
+            </w:pPr>
+            <w:r>
+              <w:rPr>
+                <w:sz w:val="19"/>
+              </w:rPr>
+              <w:t>Bugs &amp; defects by module</w:t>
+            </w:r>
+          </w:p>
+        </w:tc>
+      </w:tr>
+      <w:tr>
+        <w:tc>
+          <w:tcPr>
+            <w:tcW w:type="dxa" w:w="1872"/>
+            <w:shd w:val="clear" w:color="auto" w:fill="FFFFFF"/>
+          </w:tcPr>
+          <w:p>
+            <w:pPr>
+              <w:spacing w:before="60" w:after="60"/>
+            </w:pPr>
+            <w:r>
+              <w:rPr>
+                <w:sz w:val="19"/>
+              </w:rPr>
+              <w:t>feature_insights</w:t>
+            </w:r>
+          </w:p>
+        </w:tc>
+        <w:tc>
+          <w:tcPr>
+            <w:tcW w:type="dxa" w:w="2592"/>
+            <w:shd w:val="clear" w:color="auto" w:fill="FFFFFF"/>
+          </w:tcPr>
+          <w:p>
+            <w:pPr>
+              <w:spacing w:before="60" w:after="60"/>
+            </w:pPr>
+            <w:r>
+              <w:rPr>
+                <w:sz w:val="19"/>
+              </w:rPr>
+              <w:t>Feature Intelligence</w:t>
+            </w:r>
+          </w:p>
+        </w:tc>
+        <w:tc>
+          <w:tcPr>
+            <w:tcW w:type="dxa" w:w="2016"/>
+            <w:shd w:val="clear" w:color="auto" w:fill="FFFFFF"/>
+          </w:tcPr>
+          <w:p>
+            <w:pPr>
+              <w:spacing w:before="60" w:after="60"/>
+            </w:pPr>
+            <w:r>
+              <w:rPr>
+                <w:sz w:val="19"/>
+              </w:rPr>
+              <w:t>Dashboard / Report</w:t>
+            </w:r>
+          </w:p>
+        </w:tc>
+        <w:tc>
+          <w:tcPr>
+            <w:tcW w:type="dxa" w:w="1296"/>
+            <w:shd w:val="clear" w:color="auto" w:fill="FFFFFF"/>
+          </w:tcPr>
+          <w:p>
+            <w:pPr>
+              <w:spacing w:before="60" w:after="60"/>
+            </w:pPr>
+            <w:r>
+              <w:rPr>
+                <w:sz w:val="19"/>
+              </w:rPr>
+              <w:t>Bento Grid</w:t>
+            </w:r>
+          </w:p>
+        </w:tc>
+        <w:tc>
+          <w:tcPr>
+            <w:tcW w:type="dxa" w:w="2304"/>
+            <w:shd w:val="clear" w:color="auto" w:fill="FFFFFF"/>
+          </w:tcPr>
+          <w:p>
+            <w:pPr>
+              <w:spacing w:before="60" w:after="60"/>
+            </w:pPr>
+            <w:r>
+              <w:rPr>
+                <w:sz w:val="19"/>
+              </w:rPr>
+              <w:t>Feature matrix progress</w:t>
+            </w:r>
+          </w:p>
+        </w:tc>
+      </w:tr>
+      <w:tr>
+        <w:tc>
+          <w:tcPr>
+            <w:tcW w:type="dxa" w:w="1872"/>
+            <w:shd w:val="clear" w:color="auto" w:fill="F8F9FA"/>
+          </w:tcPr>
+          <w:p>
+            <w:pPr>
+              <w:spacing w:before="60" w:after="60"/>
+            </w:pPr>
+            <w:r>
+              <w:rPr>
+                <w:sz w:val="19"/>
+              </w:rPr>
+              <w:t>screen_status</w:t>
+            </w:r>
+          </w:p>
+        </w:tc>
+        <w:tc>
+          <w:tcPr>
+            <w:tcW w:type="dxa" w:w="2592"/>
+            <w:shd w:val="clear" w:color="auto" w:fill="F8F9FA"/>
+          </w:tcPr>
+          <w:p>
+            <w:pPr>
+              <w:spacing w:before="60" w:after="60"/>
+            </w:pPr>
+            <w:r>
+              <w:rPr>
+                <w:sz w:val="19"/>
+              </w:rPr>
+              <w:t>Screen Status Details</w:t>
+            </w:r>
+          </w:p>
+        </w:tc>
+        <w:tc>
+          <w:tcPr>
+            <w:tcW w:type="dxa" w:w="2016"/>
+            <w:shd w:val="clear" w:color="auto" w:fill="F8F9FA"/>
+          </w:tcPr>
+          <w:p>
+            <w:pPr>
+              <w:spacing w:before="60" w:after="60"/>
+            </w:pPr>
+            <w:r>
+              <w:rPr>
+                <w:sz w:val="19"/>
+              </w:rPr>
+              <w:t>Dashboard / Report</w:t>
+            </w:r>
+          </w:p>
+        </w:tc>
+        <w:tc>
+          <w:tcPr>
+            <w:tcW w:type="dxa" w:w="1296"/>
+            <w:shd w:val="clear" w:color="auto" w:fill="F8F9FA"/>
+          </w:tcPr>
+          <w:p>
+            <w:pPr>
+              <w:spacing w:before="60" w:after="60"/>
+            </w:pPr>
+            <w:r>
+              <w:rPr>
+                <w:sz w:val="19"/>
+              </w:rPr>
+              <w:t>Table</w:t>
+            </w:r>
+          </w:p>
+        </w:tc>
+        <w:tc>
+          <w:tcPr>
+            <w:tcW w:type="dxa" w:w="2304"/>
+            <w:shd w:val="clear" w:color="auto" w:fill="F8F9FA"/>
+          </w:tcPr>
+          <w:p>
+            <w:pPr>
+              <w:spacing w:before="60" w:after="60"/>
+            </w:pPr>
+            <w:r>
+              <w:rPr>
+                <w:sz w:val="19"/>
+              </w:rPr>
+              <w:t>GUI Screen completions</w:t>
+            </w:r>
+          </w:p>
+        </w:tc>
+      </w:tr>
+      <w:tr>
+        <w:tc>
+          <w:tcPr>
+            <w:tcW w:type="dxa" w:w="1872"/>
+            <w:shd w:val="clear" w:color="auto" w:fill="FFFFFF"/>
+          </w:tcPr>
+          <w:p>
+            <w:pPr>
+              <w:spacing w:before="60" w:after="60"/>
+            </w:pPr>
+            <w:r>
+              <w:rPr>
+                <w:sz w:val="19"/>
+              </w:rPr>
+              <w:t>release_timeline</w:t>
+            </w:r>
+          </w:p>
+        </w:tc>
+        <w:tc>
+          <w:tcPr>
+            <w:tcW w:type="dxa" w:w="2592"/>
+            <w:shd w:val="clear" w:color="auto" w:fill="FFFFFF"/>
+          </w:tcPr>
+          <w:p>
+            <w:pPr>
+              <w:spacing w:before="60" w:after="60"/>
+            </w:pPr>
+            <w:r>
+              <w:rPr>
+                <w:sz w:val="19"/>
+              </w:rPr>
+              <w:t>Release Timeline</w:t>
+            </w:r>
+          </w:p>
+        </w:tc>
+        <w:tc>
+          <w:tcPr>
+            <w:tcW w:type="dxa" w:w="2016"/>
+            <w:shd w:val="clear" w:color="auto" w:fill="FFFFFF"/>
+          </w:tcPr>
+          <w:p>
+            <w:pPr>
+              <w:spacing w:before="60" w:after="60"/>
+            </w:pPr>
+            <w:r>
+              <w:rPr>
+                <w:sz w:val="19"/>
+              </w:rPr>
+              <w:t>Dashboard / Report</w:t>
+            </w:r>
+          </w:p>
+        </w:tc>
+        <w:tc>
+          <w:tcPr>
+            <w:tcW w:type="dxa" w:w="1296"/>
+            <w:shd w:val="clear" w:color="auto" w:fill="FFFFFF"/>
+          </w:tcPr>
+          <w:p>
+            <w:pPr>
+              <w:spacing w:before="60" w:after="60"/>
+            </w:pPr>
+            <w:r>
+              <w:rPr>
+                <w:sz w:val="19"/>
+              </w:rPr>
+              <w:t>Visual Chart</w:t>
+            </w:r>
+          </w:p>
+        </w:tc>
+        <w:tc>
+          <w:tcPr>
+            <w:tcW w:type="dxa" w:w="2304"/>
+            <w:shd w:val="clear" w:color="auto" w:fill="FFFFFF"/>
+          </w:tcPr>
+          <w:p>
+            <w:pPr>
+              <w:spacing w:before="60" w:after="60"/>
+            </w:pPr>
+            <w:r>
+              <w:rPr>
+                <w:sz w:val="19"/>
+              </w:rPr>
+              <w:t>Version releases</w:t>
+            </w:r>
+          </w:p>
+        </w:tc>
+      </w:tr>
+      <w:tr>
+        <w:tc>
+          <w:tcPr>
+            <w:tcW w:type="dxa" w:w="1872"/>
+            <w:shd w:val="clear" w:color="auto" w:fill="F8F9FA"/>
+          </w:tcPr>
+          <w:p>
+            <w:pPr>
+              <w:spacing w:before="60" w:after="60"/>
+            </w:pPr>
+            <w:r>
+              <w:rPr>
+                <w:sz w:val="19"/>
+              </w:rPr>
+              <w:t>milestone_timeline</w:t>
+            </w:r>
+          </w:p>
+        </w:tc>
+        <w:tc>
+          <w:tcPr>
+            <w:tcW w:type="dxa" w:w="2592"/>
+            <w:shd w:val="clear" w:color="auto" w:fill="F8F9FA"/>
+          </w:tcPr>
+          <w:p>
+            <w:pPr>
+              <w:spacing w:before="60" w:after="60"/>
+            </w:pPr>
+            <w:r>
+              <w:rPr>
+                <w:sz w:val="19"/>
+              </w:rPr>
+              <w:t>Milestone Timeline</w:t>
+            </w:r>
+          </w:p>
+        </w:tc>
+        <w:tc>
+          <w:tcPr>
+            <w:tcW w:type="dxa" w:w="2016"/>
+            <w:shd w:val="clear" w:color="auto" w:fill="F8F9FA"/>
+          </w:tcPr>
+          <w:p>
+            <w:pPr>
+              <w:spacing w:before="60" w:after="60"/>
+            </w:pPr>
+            <w:r>
+              <w:rPr>
+                <w:sz w:val="19"/>
+              </w:rPr>
+              <w:t>Dashboard / Report</w:t>
+            </w:r>
+          </w:p>
+        </w:tc>
+        <w:tc>
+          <w:tcPr>
+            <w:tcW w:type="dxa" w:w="1296"/>
+            <w:shd w:val="clear" w:color="auto" w:fill="F8F9FA"/>
+          </w:tcPr>
+          <w:p>
+            <w:pPr>
+              <w:spacing w:before="60" w:after="60"/>
+            </w:pPr>
+            <w:r>
+              <w:rPr>
+                <w:sz w:val="19"/>
+              </w:rPr>
+              <w:t>Visual List</w:t>
+            </w:r>
+          </w:p>
+        </w:tc>
+        <w:tc>
+          <w:tcPr>
+            <w:tcW w:type="dxa" w:w="2304"/>
+            <w:shd w:val="clear" w:color="auto" w:fill="F8F9FA"/>
+          </w:tcPr>
+          <w:p>
+            <w:pPr>
+              <w:spacing w:before="60" w:after="60"/>
+            </w:pPr>
+            <w:r>
+              <w:rPr>
+                <w:sz w:val="19"/>
+              </w:rPr>
+              <w:t>Milestone tasks</w:t>
+            </w:r>
+          </w:p>
+        </w:tc>
+      </w:tr>
+      <w:tr>
+        <w:tc>
+          <w:tcPr>
+            <w:tcW w:type="dxa" w:w="1872"/>
+            <w:shd w:val="clear" w:color="auto" w:fill="FFFFFF"/>
+          </w:tcPr>
+          <w:p>
+            <w:pPr>
+              <w:spacing w:before="60" w:after="60"/>
+            </w:pPr>
+            <w:r>
+              <w:rPr>
+                <w:sz w:val="19"/>
+              </w:rPr>
+              <w:t>burndown</w:t>
+            </w:r>
+          </w:p>
+        </w:tc>
+        <w:tc>
+          <w:tcPr>
+            <w:tcW w:type="dxa" w:w="2592"/>
+            <w:shd w:val="clear" w:color="auto" w:fill="FFFFFF"/>
+          </w:tcPr>
+          <w:p>
+            <w:pPr>
+              <w:spacing w:before="60" w:after="60"/>
+            </w:pPr>
+            <w:r>
+              <w:rPr>
+                <w:sz w:val="19"/>
+              </w:rPr>
+              <w:t>Burndown Chart</w:t>
+            </w:r>
+          </w:p>
+        </w:tc>
+        <w:tc>
+          <w:tcPr>
+            <w:tcW w:type="dxa" w:w="2016"/>
+            <w:shd w:val="clear" w:color="auto" w:fill="FFFFFF"/>
+          </w:tcPr>
+          <w:p>
+            <w:pPr>
+              <w:spacing w:before="60" w:after="60"/>
+            </w:pPr>
+            <w:r>
+              <w:rPr>
+                <w:sz w:val="19"/>
+              </w:rPr>
+              <w:t>Dashboard / Report</w:t>
+            </w:r>
+          </w:p>
+        </w:tc>
+        <w:tc>
+          <w:tcPr>
+            <w:tcW w:type="dxa" w:w="1296"/>
+            <w:shd w:val="clear" w:color="auto" w:fill="FFFFFF"/>
+          </w:tcPr>
+          <w:p>
+            <w:pPr>
+              <w:spacing w:before="60" w:after="60"/>
+            </w:pPr>
+            <w:r>
+              <w:rPr>
+                <w:sz w:val="19"/>
+              </w:rPr>
+              <w:t>SVG Chart</w:t>
+            </w:r>
+          </w:p>
+        </w:tc>
+        <w:tc>
+          <w:tcPr>
+            <w:tcW w:type="dxa" w:w="2304"/>
+            <w:shd w:val="clear" w:color="auto" w:fill="FFFFFF"/>
+          </w:tcPr>
+          <w:p>
+            <w:pPr>
+              <w:spacing w:before="60" w:after="60"/>
+            </w:pPr>
+            <w:r>
+              <w:rPr>
+                <w:sz w:val="19"/>
+              </w:rPr>
+              <w:t>Task baseline vs actuals</w:t>
+            </w:r>
+          </w:p>
+        </w:tc>
+      </w:tr>
+      <w:tr>
+        <w:tc>
+          <w:tcPr>
+            <w:tcW w:type="dxa" w:w="1872"/>
+            <w:shd w:val="clear" w:color="auto" w:fill="F8F9FA"/>
+          </w:tcPr>
+          <w:p>
+            <w:pPr>
+              <w:spacing w:before="60" w:after="60"/>
+            </w:pPr>
+            <w:r>
+              <w:rPr>
+                <w:sz w:val="19"/>
+              </w:rPr>
+              <w:t>velocity</w:t>
+            </w:r>
+          </w:p>
+        </w:tc>
+        <w:tc>
+          <w:tcPr>
+            <w:tcW w:type="dxa" w:w="2592"/>
+            <w:shd w:val="clear" w:color="auto" w:fill="F8F9FA"/>
+          </w:tcPr>
+          <w:p>
+            <w:pPr>
+              <w:spacing w:before="60" w:after="60"/>
+            </w:pPr>
+            <w:r>
+              <w:rPr>
+                <w:sz w:val="19"/>
+              </w:rPr>
+              <w:t>Weekly Velocity</w:t>
+            </w:r>
+          </w:p>
+        </w:tc>
+        <w:tc>
+          <w:tcPr>
+            <w:tcW w:type="dxa" w:w="2016"/>
+            <w:shd w:val="clear" w:color="auto" w:fill="F8F9FA"/>
+          </w:tcPr>
+          <w:p>
+            <w:pPr>
+              <w:spacing w:before="60" w:after="60"/>
+            </w:pPr>
+            <w:r>
+              <w:rPr>
+                <w:sz w:val="19"/>
+              </w:rPr>
+              <w:t>Dashboard / Report</w:t>
+            </w:r>
+          </w:p>
+        </w:tc>
+        <w:tc>
+          <w:tcPr>
+            <w:tcW w:type="dxa" w:w="1296"/>
+            <w:shd w:val="clear" w:color="auto" w:fill="F8F9FA"/>
+          </w:tcPr>
+          <w:p>
+            <w:pPr>
+              <w:spacing w:before="60" w:after="60"/>
+            </w:pPr>
+            <w:r>
+              <w:rPr>
+                <w:sz w:val="19"/>
+              </w:rPr>
+              <w:t>Bar Chart</w:t>
+            </w:r>
+          </w:p>
+        </w:tc>
+        <w:tc>
+          <w:tcPr>
+            <w:tcW w:type="dxa" w:w="2304"/>
+            <w:shd w:val="clear" w:color="auto" w:fill="F8F9FA"/>
+          </w:tcPr>
+          <w:p>
+            <w:pPr>
+              <w:spacing w:before="60" w:after="60"/>
+            </w:pPr>
+            <w:r>
+              <w:rPr>
+                <w:sz w:val="19"/>
+              </w:rPr>
+              <w:t>Weekly completed effort</w:t>
+            </w:r>
+          </w:p>
+        </w:tc>
+      </w:tr>
+      <w:tr>
+        <w:tc>
+          <w:tcPr>
+            <w:tcW w:type="dxa" w:w="1872"/>
+            <w:shd w:val="clear" w:color="auto" w:fill="FFFFFF"/>
+          </w:tcPr>
+          <w:p>
+            <w:pPr>
+              <w:spacing w:before="60" w:after="60"/>
+            </w:pPr>
+            <w:r>
+              <w:rPr>
+                <w:sz w:val="19"/>
+              </w:rPr>
+              <w:t>cfd</w:t>
+            </w:r>
+          </w:p>
+        </w:tc>
+        <w:tc>
+          <w:tcPr>
+            <w:tcW w:type="dxa" w:w="2592"/>
+            <w:shd w:val="clear" w:color="auto" w:fill="FFFFFF"/>
+          </w:tcPr>
+          <w:p>
+            <w:pPr>
+              <w:spacing w:before="60" w:after="60"/>
+            </w:pPr>
+            <w:r>
+              <w:rPr>
+                <w:sz w:val="19"/>
+              </w:rPr>
+              <w:t>Cumulative Flow</w:t>
+            </w:r>
+          </w:p>
+        </w:tc>
+        <w:tc>
+          <w:tcPr>
+            <w:tcW w:type="dxa" w:w="2016"/>
+            <w:shd w:val="clear" w:color="auto" w:fill="FFFFFF"/>
+          </w:tcPr>
+          <w:p>
+            <w:pPr>
+              <w:spacing w:before="60" w:after="60"/>
+            </w:pPr>
+            <w:r>
+              <w:rPr>
+                <w:sz w:val="19"/>
+              </w:rPr>
+              <w:t>Dashboard / Report</w:t>
+            </w:r>
+          </w:p>
+        </w:tc>
+        <w:tc>
+          <w:tcPr>
+            <w:tcW w:type="dxa" w:w="1296"/>
+            <w:shd w:val="clear" w:color="auto" w:fill="FFFFFF"/>
+          </w:tcPr>
+          <w:p>
+            <w:pPr>
+              <w:spacing w:before="60" w:after="60"/>
+            </w:pPr>
+            <w:r>
+              <w:rPr>
+                <w:sz w:val="19"/>
+              </w:rPr>
+              <w:t>Area Chart</w:t>
+            </w:r>
+          </w:p>
+        </w:tc>
+        <w:tc>
+          <w:tcPr>
+            <w:tcW w:type="dxa" w:w="2304"/>
+            <w:shd w:val="clear" w:color="auto" w:fill="FFFFFF"/>
+          </w:tcPr>
+          <w:p>
+            <w:pPr>
+              <w:spacing w:before="60" w:after="60"/>
+            </w:pPr>
+            <w:r>
+              <w:rPr>
+                <w:sz w:val="19"/>
+              </w:rPr>
+              <w:t>Task status transition log</w:t>
+            </w:r>
+          </w:p>
+        </w:tc>
+      </w:tr>
+      <w:tr>
+        <w:tc>
+          <w:tcPr>
+            <w:tcW w:type="dxa" w:w="1872"/>
+            <w:shd w:val="clear" w:color="auto" w:fill="F8F9FA"/>
+          </w:tcPr>
+          <w:p>
+            <w:pPr>
+              <w:spacing w:before="60" w:after="60"/>
+            </w:pPr>
+            <w:r>
+              <w:rPr>
+                <w:sz w:val="19"/>
+              </w:rPr>
+              <w:t>overdue</w:t>
+            </w:r>
+          </w:p>
+        </w:tc>
+        <w:tc>
+          <w:tcPr>
+            <w:tcW w:type="dxa" w:w="2592"/>
+            <w:shd w:val="clear" w:color="auto" w:fill="F8F9FA"/>
+          </w:tcPr>
+          <w:p>
+            <w:pPr>
+              <w:spacing w:before="60" w:after="60"/>
+            </w:pPr>
+            <w:r>
+              <w:rPr>
+                <w:sz w:val="19"/>
+              </w:rPr>
+              <w:t>Overdue Attention</w:t>
+            </w:r>
+          </w:p>
+        </w:tc>
+        <w:tc>
+          <w:tcPr>
+            <w:tcW w:type="dxa" w:w="2016"/>
+            <w:shd w:val="clear" w:color="auto" w:fill="F8F9FA"/>
+          </w:tcPr>
+          <w:p>
+            <w:pPr>
+              <w:spacing w:before="60" w:after="60"/>
+            </w:pPr>
+            <w:r>
+              <w:rPr>
+                <w:sz w:val="19"/>
+              </w:rPr>
+              <w:t>Dashboard / Report</w:t>
+            </w:r>
+          </w:p>
+        </w:tc>
+        <w:tc>
+          <w:tcPr>
+            <w:tcW w:type="dxa" w:w="1296"/>
+            <w:shd w:val="clear" w:color="auto" w:fill="F8F9FA"/>
+          </w:tcPr>
+          <w:p>
+            <w:pPr>
+              <w:spacing w:before="60" w:after="60"/>
+            </w:pPr>
+            <w:r>
+              <w:rPr>
+                <w:sz w:val="19"/>
+              </w:rPr>
+              <w:t>List</w:t>
+            </w:r>
+          </w:p>
+        </w:tc>
+        <w:tc>
+          <w:tcPr>
+            <w:tcW w:type="dxa" w:w="2304"/>
+            <w:shd w:val="clear" w:color="auto" w:fill="F8F9FA"/>
+          </w:tcPr>
+          <w:p>
+            <w:pPr>
+              <w:spacing w:before="60" w:after="60"/>
+            </w:pPr>
+            <w:r>
+              <w:rPr>
+                <w:sz w:val="19"/>
+              </w:rPr>
+              <w:t>Overdue tasks list</w:t>
+            </w:r>
+          </w:p>
+        </w:tc>
+      </w:tr>
+      <w:tr>
+        <w:tc>
+          <w:tcPr>
+            <w:tcW w:type="dxa" w:w="1872"/>
+            <w:shd w:val="clear" w:color="auto" w:fill="FFFFFF"/>
+          </w:tcPr>
+          <w:p>
+            <w:pPr>
+              <w:spacing w:before="60" w:after="60"/>
+            </w:pPr>
+            <w:r>
+              <w:rPr>
+                <w:sz w:val="19"/>
+              </w:rPr>
+              <w:t>high_impact_entities</w:t>
+            </w:r>
+          </w:p>
+        </w:tc>
+        <w:tc>
+          <w:tcPr>
+            <w:tcW w:type="dxa" w:w="2592"/>
+            <w:shd w:val="clear" w:color="auto" w:fill="FFFFFF"/>
+          </w:tcPr>
+          <w:p>
+            <w:pPr>
+              <w:spacing w:before="60" w:after="60"/>
+            </w:pPr>
+            <w:r>
+              <w:rPr>
+                <w:sz w:val="19"/>
+              </w:rPr>
+              <w:t>High Impact Entities</w:t>
+            </w:r>
+          </w:p>
+        </w:tc>
+        <w:tc>
+          <w:tcPr>
+            <w:tcW w:type="dxa" w:w="2016"/>
+            <w:shd w:val="clear" w:color="auto" w:fill="FFFFFF"/>
+          </w:tcPr>
+          <w:p>
+            <w:pPr>
+              <w:spacing w:before="60" w:after="60"/>
+            </w:pPr>
+            <w:r>
+              <w:rPr>
+                <w:sz w:val="19"/>
+              </w:rPr>
+              <w:t>Dashboard</w:t>
+            </w:r>
+          </w:p>
+        </w:tc>
+        <w:tc>
+          <w:tcPr>
+            <w:tcW w:type="dxa" w:w="1296"/>
+            <w:shd w:val="clear" w:color="auto" w:fill="FFFFFF"/>
+          </w:tcPr>
+          <w:p>
+            <w:pPr>
+              <w:spacing w:before="60" w:after="60"/>
+            </w:pPr>
+            <w:r>
+              <w:rPr>
+                <w:sz w:val="19"/>
+              </w:rPr>
+              <w:t>List</w:t>
+            </w:r>
+          </w:p>
+        </w:tc>
+        <w:tc>
+          <w:tcPr>
+            <w:tcW w:type="dxa" w:w="2304"/>
+            <w:shd w:val="clear" w:color="auto" w:fill="FFFFFF"/>
+          </w:tcPr>
+          <w:p>
+            <w:pPr>
+              <w:spacing w:before="60" w:after="60"/>
+            </w:pPr>
+            <w:r>
+              <w:rPr>
+                <w:sz w:val="19"/>
+              </w:rPr>
+              <w:t>Predecessor dependency counts</w:t>
+            </w:r>
+          </w:p>
+        </w:tc>
+      </w:tr>
+      <w:tr>
+        <w:tc>
+          <w:tcPr>
+            <w:tcW w:type="dxa" w:w="1872"/>
+            <w:shd w:val="clear" w:color="auto" w:fill="F8F9FA"/>
+          </w:tcPr>
+          <w:p>
+            <w:pPr>
+              <w:spacing w:before="60" w:after="60"/>
+            </w:pPr>
+            <w:r>
+              <w:rPr>
+                <w:sz w:val="19"/>
+              </w:rPr>
+              <w:t>workload</w:t>
+            </w:r>
+          </w:p>
+        </w:tc>
+        <w:tc>
+          <w:tcPr>
+            <w:tcW w:type="dxa" w:w="2592"/>
+            <w:shd w:val="clear" w:color="auto" w:fill="F8F9FA"/>
+          </w:tcPr>
+          <w:p>
+            <w:pPr>
+              <w:spacing w:before="60" w:after="60"/>
+            </w:pPr>
+            <w:r>
+              <w:rPr>
+                <w:sz w:val="19"/>
+              </w:rPr>
+              <w:t>Team Workload</w:t>
+            </w:r>
+          </w:p>
+        </w:tc>
+        <w:tc>
+          <w:tcPr>
+            <w:tcW w:type="dxa" w:w="2016"/>
+            <w:shd w:val="clear" w:color="auto" w:fill="F8F9FA"/>
+          </w:tcPr>
+          <w:p>
+            <w:pPr>
+              <w:spacing w:before="60" w:after="60"/>
+            </w:pPr>
+            <w:r>
+              <w:rPr>
+                <w:sz w:val="19"/>
+              </w:rPr>
+              <w:t>Dashboard / Report</w:t>
+            </w:r>
+          </w:p>
+        </w:tc>
+        <w:tc>
+          <w:tcPr>
+            <w:tcW w:type="dxa" w:w="1296"/>
+            <w:shd w:val="clear" w:color="auto" w:fill="F8F9FA"/>
+          </w:tcPr>
+          <w:p>
+            <w:pPr>
+              <w:spacing w:before="60" w:after="60"/>
+            </w:pPr>
+            <w:r>
+              <w:rPr>
+                <w:sz w:val="19"/>
+              </w:rPr>
+              <w:t>Bar Chart</w:t>
+            </w:r>
+          </w:p>
+        </w:tc>
+        <w:tc>
+          <w:tcPr>
+            <w:tcW w:type="dxa" w:w="2304"/>
+            <w:shd w:val="clear" w:color="auto" w:fill="F8F9FA"/>
+          </w:tcPr>
+          <w:p>
+            <w:pPr>
+              <w:spacing w:before="60" w:after="60"/>
+            </w:pPr>
+            <w:r>
+              <w:rPr>
+                <w:sz w:val="19"/>
+              </w:rPr>
+              <w:t>Assigned task effort</w:t>
+            </w:r>
+          </w:p>
+        </w:tc>
+      </w:tr>
+      <w:tr>
+        <w:tc>
+          <w:tcPr>
+            <w:tcW w:type="dxa" w:w="1872"/>
+            <w:shd w:val="clear" w:color="auto" w:fill="FFFFFF"/>
+          </w:tcPr>
+          <w:p>
+            <w:pPr>
+              <w:spacing w:before="60" w:after="60"/>
+            </w:pPr>
+            <w:r>
+              <w:rPr>
+                <w:sz w:val="19"/>
+              </w:rPr>
+              <w:t>cat_hours</w:t>
+            </w:r>
+          </w:p>
+        </w:tc>
+        <w:tc>
+          <w:tcPr>
+            <w:tcW w:type="dxa" w:w="2592"/>
+            <w:shd w:val="clear" w:color="auto" w:fill="FFFFFF"/>
+          </w:tcPr>
+          <w:p>
+            <w:pPr>
+              <w:spacing w:before="60" w:after="60"/>
+            </w:pPr>
+            <w:r>
+              <w:rPr>
+                <w:sz w:val="19"/>
+              </w:rPr>
+              <w:t>Category &amp; Effort</w:t>
+            </w:r>
+          </w:p>
+        </w:tc>
+        <w:tc>
+          <w:tcPr>
+            <w:tcW w:type="dxa" w:w="2016"/>
+            <w:shd w:val="clear" w:color="auto" w:fill="FFFFFF"/>
+          </w:tcPr>
+          <w:p>
+            <w:pPr>
+              <w:spacing w:before="60" w:after="60"/>
+            </w:pPr>
+            <w:r>
+              <w:rPr>
+                <w:sz w:val="19"/>
+              </w:rPr>
+              <w:t>Dashboard / Report</w:t>
+            </w:r>
+          </w:p>
+        </w:tc>
+        <w:tc>
+          <w:tcPr>
+            <w:tcW w:type="dxa" w:w="1296"/>
+            <w:shd w:val="clear" w:color="auto" w:fill="FFFFFF"/>
+          </w:tcPr>
+          <w:p>
+            <w:pPr>
+              <w:spacing w:before="60" w:after="60"/>
+            </w:pPr>
+            <w:r>
+              <w:rPr>
+                <w:sz w:val="19"/>
+              </w:rPr>
+              <w:t>Donut Chart</w:t>
+            </w:r>
+          </w:p>
+        </w:tc>
+        <w:tc>
+          <w:tcPr>
+            <w:tcW w:type="dxa" w:w="2304"/>
+            <w:shd w:val="clear" w:color="auto" w:fill="FFFFFF"/>
+          </w:tcPr>
+          <w:p>
+            <w:pPr>
+              <w:spacing w:before="60" w:after="60"/>
+            </w:pPr>
+            <w:r>
+              <w:rPr>
+                <w:sz w:val="19"/>
+              </w:rPr>
+              <w:t>Task category distribution</w:t>
+            </w:r>
+          </w:p>
+        </w:tc>
+      </w:tr>
+      <w:tr>
+        <w:tc>
+          <w:tcPr>
+            <w:tcW w:type="dxa" w:w="1872"/>
+            <w:shd w:val="clear" w:color="auto" w:fill="F8F9FA"/>
+          </w:tcPr>
+          <w:p>
+            <w:pPr>
+              <w:spacing w:before="60" w:after="60"/>
+            </w:pPr>
+            <w:r>
+              <w:rPr>
+                <w:sz w:val="19"/>
+              </w:rPr>
+              <w:t>defect_intel</w:t>
+            </w:r>
+          </w:p>
+        </w:tc>
+        <w:tc>
+          <w:tcPr>
+            <w:tcW w:type="dxa" w:w="2592"/>
+            <w:shd w:val="clear" w:color="auto" w:fill="F8F9FA"/>
+          </w:tcPr>
+          <w:p>
+            <w:pPr>
+              <w:spacing w:before="60" w:after="60"/>
+            </w:pPr>
+            <w:r>
+              <w:rPr>
+                <w:sz w:val="19"/>
+              </w:rPr>
+              <w:t>Defect Intelligence</w:t>
+            </w:r>
+          </w:p>
+        </w:tc>
+        <w:tc>
+          <w:tcPr>
+            <w:tcW w:type="dxa" w:w="2016"/>
+            <w:shd w:val="clear" w:color="auto" w:fill="F8F9FA"/>
+          </w:tcPr>
+          <w:p>
+            <w:pPr>
+              <w:spacing w:before="60" w:after="60"/>
+            </w:pPr>
+            <w:r>
+              <w:rPr>
+                <w:sz w:val="19"/>
+              </w:rPr>
+              <w:t>Dashboard / Report</w:t>
+            </w:r>
+          </w:p>
+        </w:tc>
+        <w:tc>
+          <w:tcPr>
+            <w:tcW w:type="dxa" w:w="1296"/>
+            <w:shd w:val="clear" w:color="auto" w:fill="F8F9FA"/>
+          </w:tcPr>
+          <w:p>
+            <w:pPr>
+              <w:spacing w:before="60" w:after="60"/>
+            </w:pPr>
+            <w:r>
+              <w:rPr>
+                <w:sz w:val="19"/>
+              </w:rPr>
+              <w:t>Bento Statistics</w:t>
+            </w:r>
+          </w:p>
+        </w:tc>
+        <w:tc>
+          <w:tcPr>
+            <w:tcW w:type="dxa" w:w="2304"/>
+            <w:shd w:val="clear" w:color="auto" w:fill="F8F9FA"/>
+          </w:tcPr>
+          <w:p>
+            <w:pPr>
+              <w:spacing w:before="60" w:after="60"/>
+            </w:pPr>
+            <w:r>
+              <w:rPr>
+                <w:sz w:val="19"/>
+              </w:rPr>
+              <w:t>Defects registry log</w:t>
+            </w:r>
+          </w:p>
+        </w:tc>
+      </w:tr>
+      <w:tr>
+        <w:tc>
+          <w:tcPr>
+            <w:tcW w:type="dxa" w:w="1872"/>
+            <w:shd w:val="clear" w:color="auto" w:fill="FFFFFF"/>
+          </w:tcPr>
+          <w:p>
+            <w:pPr>
+              <w:spacing w:before="60" w:after="60"/>
+            </w:pPr>
+            <w:r>
+              <w:rPr>
+                <w:sz w:val="19"/>
+              </w:rPr>
+              <w:t>intelligence</w:t>
+            </w:r>
+          </w:p>
+        </w:tc>
+        <w:tc>
+          <w:tcPr>
+            <w:tcW w:type="dxa" w:w="2592"/>
+            <w:shd w:val="clear" w:color="auto" w:fill="FFFFFF"/>
+          </w:tcPr>
+          <w:p>
+            <w:pPr>
+              <w:spacing w:before="60" w:after="60"/>
+            </w:pPr>
+            <w:r>
+              <w:rPr>
+                <w:sz w:val="19"/>
+              </w:rPr>
+              <w:t>Predictive Intelligence</w:t>
+            </w:r>
+          </w:p>
+        </w:tc>
+        <w:tc>
+          <w:tcPr>
+            <w:tcW w:type="dxa" w:w="2016"/>
+            <w:shd w:val="clear" w:color="auto" w:fill="FFFFFF"/>
+          </w:tcPr>
+          <w:p>
+            <w:pPr>
+              <w:spacing w:before="60" w:after="60"/>
+            </w:pPr>
+            <w:r>
+              <w:rPr>
+                <w:sz w:val="19"/>
+              </w:rPr>
+              <w:t>Dashboard / Report</w:t>
+            </w:r>
+          </w:p>
+        </w:tc>
+        <w:tc>
+          <w:tcPr>
+            <w:tcW w:type="dxa" w:w="1296"/>
+            <w:shd w:val="clear" w:color="auto" w:fill="FFFFFF"/>
+          </w:tcPr>
+          <w:p>
+            <w:pPr>
+              <w:spacing w:before="60" w:after="60"/>
+            </w:pPr>
+            <w:r>
+              <w:rPr>
+                <w:sz w:val="19"/>
+              </w:rPr>
+              <w:t>ML Forecast</w:t>
+            </w:r>
+          </w:p>
+        </w:tc>
+        <w:tc>
+          <w:tcPr>
+            <w:tcW w:type="dxa" w:w="2304"/>
+            <w:shd w:val="clear" w:color="auto" w:fill="FFFFFF"/>
+          </w:tcPr>
+          <w:p>
+            <w:pPr>
+              <w:spacing w:before="60" w:after="60"/>
+            </w:pPr>
+            <w:r>
+              <w:rPr>
+                <w:sz w:val="19"/>
+              </w:rPr>
+              <w:t>EVM velocity projection</w:t>
+            </w:r>
+          </w:p>
+        </w:tc>
+      </w:tr>
+      <w:tr>
+        <w:tc>
+          <w:tcPr>
+            <w:tcW w:type="dxa" w:w="1872"/>
+            <w:shd w:val="clear" w:color="auto" w:fill="F8F9FA"/>
+          </w:tcPr>
+          <w:p>
+            <w:pPr>
+              <w:spacing w:before="60" w:after="60"/>
+            </w:pPr>
+            <w:r>
+              <w:rPr>
+                <w:sz w:val="19"/>
+              </w:rPr>
+              <w:t>analytics</w:t>
+            </w:r>
+          </w:p>
+        </w:tc>
+        <w:tc>
+          <w:tcPr>
+            <w:tcW w:type="dxa" w:w="2592"/>
+            <w:shd w:val="clear" w:color="auto" w:fill="F8F9FA"/>
+          </w:tcPr>
+          <w:p>
+            <w:pPr>
+              <w:spacing w:before="60" w:after="60"/>
+            </w:pPr>
+            <w:r>
+              <w:rPr>
+                <w:sz w:val="19"/>
+              </w:rPr>
+              <w:t>Advanced Analytics</w:t>
+            </w:r>
+          </w:p>
+        </w:tc>
+        <w:tc>
+          <w:tcPr>
+            <w:tcW w:type="dxa" w:w="2016"/>
+            <w:shd w:val="clear" w:color="auto" w:fill="F8F9FA"/>
+          </w:tcPr>
+          <w:p>
+            <w:pPr>
+              <w:spacing w:before="60" w:after="60"/>
+            </w:pPr>
+            <w:r>
+              <w:rPr>
+                <w:sz w:val="19"/>
+              </w:rPr>
+              <w:t>Dashboard / Report</w:t>
+            </w:r>
+          </w:p>
+        </w:tc>
+        <w:tc>
+          <w:tcPr>
+            <w:tcW w:type="dxa" w:w="1296"/>
+            <w:shd w:val="clear" w:color="auto" w:fill="F8F9FA"/>
+          </w:tcPr>
+          <w:p>
+            <w:pPr>
+              <w:spacing w:before="60" w:after="60"/>
+            </w:pPr>
+            <w:r>
+              <w:rPr>
+                <w:sz w:val="19"/>
+              </w:rPr>
+              <w:t>Metric Grid</w:t>
+            </w:r>
+          </w:p>
+        </w:tc>
+        <w:tc>
+          <w:tcPr>
+            <w:tcW w:type="dxa" w:w="2304"/>
+            <w:shd w:val="clear" w:color="auto" w:fill="F8F9FA"/>
+          </w:tcPr>
+          <w:p>
+            <w:pPr>
+              <w:spacing w:before="60" w:after="60"/>
+            </w:pPr>
+            <w:r>
+              <w:rPr>
+                <w:sz w:val="19"/>
+              </w:rPr>
+              <w:t>EVM variables</w:t>
+            </w:r>
+          </w:p>
+        </w:tc>
+      </w:tr>
+      <w:tr>
+        <w:tc>
+          <w:tcPr>
+            <w:tcW w:type="dxa" w:w="1872"/>
+            <w:shd w:val="clear" w:color="auto" w:fill="FFFFFF"/>
+          </w:tcPr>
+          <w:p>
+            <w:pPr>
+              <w:spacing w:before="60" w:after="60"/>
+            </w:pPr>
+            <w:r>
+              <w:rPr>
+                <w:sz w:val="19"/>
+              </w:rPr>
+              <w:t>activity</w:t>
+            </w:r>
+          </w:p>
+        </w:tc>
+        <w:tc>
+          <w:tcPr>
+            <w:tcW w:type="dxa" w:w="2592"/>
+            <w:shd w:val="clear" w:color="auto" w:fill="FFFFFF"/>
+          </w:tcPr>
+          <w:p>
+            <w:pPr>
+              <w:spacing w:before="60" w:after="60"/>
+            </w:pPr>
+            <w:r>
+              <w:rPr>
+                <w:sz w:val="19"/>
+              </w:rPr>
+              <w:t>Recent Activity / Audit</w:t>
+            </w:r>
+          </w:p>
+        </w:tc>
+        <w:tc>
+          <w:tcPr>
+            <w:tcW w:type="dxa" w:w="2016"/>
+            <w:shd w:val="clear" w:color="auto" w:fill="FFFFFF"/>
+          </w:tcPr>
+          <w:p>
+            <w:pPr>
+              <w:spacing w:before="60" w:after="60"/>
+            </w:pPr>
+            <w:r>
+              <w:rPr>
+                <w:sz w:val="19"/>
+              </w:rPr>
+              <w:t>Dashboard / Report</w:t>
+            </w:r>
+          </w:p>
+        </w:tc>
+        <w:tc>
+          <w:tcPr>
+            <w:tcW w:type="dxa" w:w="1296"/>
+            <w:shd w:val="clear" w:color="auto" w:fill="FFFFFF"/>
+          </w:tcPr>
+          <w:p>
+            <w:pPr>
+              <w:spacing w:before="60" w:after="60"/>
+            </w:pPr>
+            <w:r>
+              <w:rPr>
+                <w:sz w:val="19"/>
+              </w:rPr>
+              <w:t>Activity Stream</w:t>
+            </w:r>
+          </w:p>
+        </w:tc>
+        <w:tc>
+          <w:tcPr>
+            <w:tcW w:type="dxa" w:w="2304"/>
+            <w:shd w:val="clear" w:color="auto" w:fill="FFFFFF"/>
+          </w:tcPr>
+          <w:p>
+            <w:pPr>
+              <w:spacing w:before="60" w:after="60"/>
+            </w:pPr>
+            <w:r>
+              <w:rPr>
+                <w:sz w:val="19"/>
+              </w:rPr>
+              <w:t>System audit log trail</w:t>
+            </w:r>
+          </w:p>
+        </w:tc>
+      </w:tr>
+      <w:tr>
+        <w:tc>
+          <w:tcPr>
+            <w:tcW w:type="dxa" w:w="1872"/>
+            <w:shd w:val="clear" w:color="auto" w:fill="F8F9FA"/>
+          </w:tcPr>
+          <w:p>
+            <w:pPr>
+              <w:spacing w:before="60" w:after="60"/>
+            </w:pPr>
+            <w:r>
+              <w:rPr>
+                <w:sz w:val="19"/>
+              </w:rPr>
+              <w:t>kpi_summary</w:t>
+            </w:r>
+          </w:p>
+        </w:tc>
+        <w:tc>
+          <w:tcPr>
+            <w:tcW w:type="dxa" w:w="2592"/>
+            <w:shd w:val="clear" w:color="auto" w:fill="F8F9FA"/>
+          </w:tcPr>
+          <w:p>
+            <w:pPr>
+              <w:spacing w:before="60" w:after="60"/>
+            </w:pPr>
+            <w:r>
+              <w:rPr>
+                <w:sz w:val="19"/>
+              </w:rPr>
+              <w:t>Executive Metrics</w:t>
+            </w:r>
+          </w:p>
+        </w:tc>
+        <w:tc>
+          <w:tcPr>
+            <w:tcW w:type="dxa" w:w="2016"/>
+            <w:shd w:val="clear" w:color="auto" w:fill="F8F9FA"/>
+          </w:tcPr>
+          <w:p>
+            <w:pPr>
+              <w:spacing w:before="60" w:after="60"/>
+            </w:pPr>
+            <w:r>
+              <w:rPr>
+                <w:sz w:val="19"/>
+              </w:rPr>
+              <w:t>Report Only</w:t>
+            </w:r>
+          </w:p>
+        </w:tc>
+        <w:tc>
+          <w:tcPr>
+            <w:tcW w:type="dxa" w:w="1296"/>
+            <w:shd w:val="clear" w:color="auto" w:fill="F8F9FA"/>
+          </w:tcPr>
+          <w:p>
+            <w:pPr>
+              <w:spacing w:before="60" w:after="60"/>
+            </w:pPr>
+            <w:r>
+              <w:rPr>
+                <w:sz w:val="19"/>
+              </w:rPr>
+              <w:t>Text Cards</w:t>
+            </w:r>
+          </w:p>
+        </w:tc>
+        <w:tc>
+          <w:tcPr>
+            <w:tcW w:type="dxa" w:w="2304"/>
+            <w:shd w:val="clear" w:color="auto" w:fill="F8F9FA"/>
+          </w:tcPr>
+          <w:p>
+            <w:pPr>
+              <w:spacing w:before="60" w:after="60"/>
+            </w:pPr>
+            <w:r>
+              <w:rPr>
+                <w:sz w:val="19"/>
+              </w:rPr>
+              <w:t>Key status summaries</w:t>
+            </w:r>
+          </w:p>
+        </w:tc>
+      </w:tr>
+      <w:tr>
+        <w:tc>
+          <w:tcPr>
+            <w:tcW w:type="dxa" w:w="1872"/>
+            <w:shd w:val="clear" w:color="auto" w:fill="FFFFFF"/>
+          </w:tcPr>
+          <w:p>
+            <w:pPr>
+              <w:spacing w:before="60" w:after="60"/>
+            </w:pPr>
+            <w:r>
+              <w:rPr>
+                <w:sz w:val="19"/>
+              </w:rPr>
+              <w:t>activities</w:t>
+            </w:r>
+          </w:p>
+        </w:tc>
+        <w:tc>
+          <w:tcPr>
+            <w:tcW w:type="dxa" w:w="2592"/>
+            <w:shd w:val="clear" w:color="auto" w:fill="FFFFFF"/>
+          </w:tcPr>
+          <w:p>
+            <w:pPr>
+              <w:spacing w:before="60" w:after="60"/>
+            </w:pPr>
+            <w:r>
+              <w:rPr>
+                <w:sz w:val="19"/>
+              </w:rPr>
+              <w:t>Key Activities</w:t>
+            </w:r>
+          </w:p>
+        </w:tc>
+        <w:tc>
+          <w:tcPr>
+            <w:tcW w:type="dxa" w:w="2016"/>
+            <w:shd w:val="clear" w:color="auto" w:fill="FFFFFF"/>
+          </w:tcPr>
+          <w:p>
+            <w:pPr>
+              <w:spacing w:before="60" w:after="60"/>
+            </w:pPr>
+            <w:r>
+              <w:rPr>
+                <w:sz w:val="19"/>
+              </w:rPr>
+              <w:t>Report Only</w:t>
+            </w:r>
+          </w:p>
+        </w:tc>
+        <w:tc>
+          <w:tcPr>
+            <w:tcW w:type="dxa" w:w="1296"/>
+            <w:shd w:val="clear" w:color="auto" w:fill="FFFFFF"/>
+          </w:tcPr>
+          <w:p>
+            <w:pPr>
+              <w:spacing w:before="60" w:after="60"/>
+            </w:pPr>
+            <w:r>
+              <w:rPr>
+                <w:sz w:val="19"/>
+              </w:rPr>
+              <w:t>Editable List</w:t>
+            </w:r>
+          </w:p>
+        </w:tc>
+        <w:tc>
+          <w:tcPr>
+            <w:tcW w:type="dxa" w:w="2304"/>
+            <w:shd w:val="clear" w:color="auto" w:fill="FFFFFF"/>
+          </w:tcPr>
+          <w:p>
+            <w:pPr>
+              <w:spacing w:before="60" w:after="60"/>
+            </w:pPr>
+            <w:r>
+              <w:rPr>
+                <w:sz w:val="19"/>
+              </w:rPr>
+              <w:t>User text entry</w:t>
+            </w:r>
+          </w:p>
+        </w:tc>
+      </w:tr>
+      <w:tr>
+        <w:tc>
+          <w:tcPr>
+            <w:tcW w:type="dxa" w:w="1872"/>
+            <w:shd w:val="clear" w:color="auto" w:fill="F8F9FA"/>
+          </w:tcPr>
+          <w:p>
+            <w:pPr>
+              <w:spacing w:before="60" w:after="60"/>
+            </w:pPr>
+            <w:r>
+              <w:rPr>
+                <w:sz w:val="19"/>
+              </w:rPr>
+              <w:t>achievements</w:t>
+            </w:r>
+          </w:p>
+        </w:tc>
+        <w:tc>
+          <w:tcPr>
+            <w:tcW w:type="dxa" w:w="2592"/>
+            <w:shd w:val="clear" w:color="auto" w:fill="F8F9FA"/>
+          </w:tcPr>
+          <w:p>
+            <w:pPr>
+              <w:spacing w:before="60" w:after="60"/>
+            </w:pPr>
+            <w:r>
+              <w:rPr>
+                <w:sz w:val="19"/>
+              </w:rPr>
+              <w:t>Achievements</w:t>
+            </w:r>
+          </w:p>
+        </w:tc>
+        <w:tc>
+          <w:tcPr>
+            <w:tcW w:type="dxa" w:w="2016"/>
+            <w:shd w:val="clear" w:color="auto" w:fill="F8F9FA"/>
+          </w:tcPr>
+          <w:p>
+            <w:pPr>
+              <w:spacing w:before="60" w:after="60"/>
+            </w:pPr>
+            <w:r>
+              <w:rPr>
+                <w:sz w:val="19"/>
+              </w:rPr>
+              <w:t>Report Only</w:t>
+            </w:r>
+          </w:p>
+        </w:tc>
+        <w:tc>
+          <w:tcPr>
+            <w:tcW w:type="dxa" w:w="1296"/>
+            <w:shd w:val="clear" w:color="auto" w:fill="F8F9FA"/>
+          </w:tcPr>
+          <w:p>
+            <w:pPr>
+              <w:spacing w:before="60" w:after="60"/>
+            </w:pPr>
+            <w:r>
+              <w:rPr>
+                <w:sz w:val="19"/>
+              </w:rPr>
+              <w:t>Highlights Card</w:t>
+            </w:r>
+          </w:p>
+        </w:tc>
+        <w:tc>
+          <w:tcPr>
+            <w:tcW w:type="dxa" w:w="2304"/>
+            <w:shd w:val="clear" w:color="auto" w:fill="F8F9FA"/>
+          </w:tcPr>
+          <w:p>
+            <w:pPr>
+              <w:spacing w:before="60" w:after="60"/>
+            </w:pPr>
+            <w:r>
+              <w:rPr>
+                <w:sz w:val="19"/>
+              </w:rPr>
+              <w:t>User text entry</w:t>
+            </w:r>
+          </w:p>
+        </w:tc>
+      </w:tr>
+      <w:tr>
+        <w:tc>
+          <w:tcPr>
+            <w:tcW w:type="dxa" w:w="1872"/>
+            <w:shd w:val="clear" w:color="auto" w:fill="FFFFFF"/>
+          </w:tcPr>
+          <w:p>
+            <w:pPr>
+              <w:spacing w:before="60" w:after="60"/>
+            </w:pPr>
+            <w:r>
+              <w:rPr>
+                <w:sz w:val="19"/>
+              </w:rPr>
+              <w:t>risks</w:t>
+            </w:r>
+          </w:p>
+        </w:tc>
+        <w:tc>
+          <w:tcPr>
+            <w:tcW w:type="dxa" w:w="2592"/>
+            <w:shd w:val="clear" w:color="auto" w:fill="FFFFFF"/>
+          </w:tcPr>
+          <w:p>
+            <w:pPr>
+              <w:spacing w:before="60" w:after="60"/>
+            </w:pPr>
+            <w:r>
+              <w:rPr>
+                <w:sz w:val="19"/>
+              </w:rPr>
+              <w:t>Risks &amp; Issues</w:t>
+            </w:r>
+          </w:p>
+        </w:tc>
+        <w:tc>
+          <w:tcPr>
+            <w:tcW w:type="dxa" w:w="2016"/>
+            <w:shd w:val="clear" w:color="auto" w:fill="FFFFFF"/>
+          </w:tcPr>
+          <w:p>
+            <w:pPr>
+              <w:spacing w:before="60" w:after="60"/>
+            </w:pPr>
+            <w:r>
+              <w:rPr>
+                <w:sz w:val="19"/>
+              </w:rPr>
+              <w:t>Report Only</w:t>
+            </w:r>
+          </w:p>
+        </w:tc>
+        <w:tc>
+          <w:tcPr>
+            <w:tcW w:type="dxa" w:w="1296"/>
+            <w:shd w:val="clear" w:color="auto" w:fill="FFFFFF"/>
+          </w:tcPr>
+          <w:p>
+            <w:pPr>
+              <w:spacing w:before="60" w:after="60"/>
+            </w:pPr>
+            <w:r>
+              <w:rPr>
+                <w:sz w:val="19"/>
+              </w:rPr>
+              <w:t>Table</w:t>
+            </w:r>
+          </w:p>
+        </w:tc>
+        <w:tc>
+          <w:tcPr>
+            <w:tcW w:type="dxa" w:w="2304"/>
+            <w:shd w:val="clear" w:color="auto" w:fill="FFFFFF"/>
+          </w:tcPr>
+          <w:p>
+            <w:pPr>
+              <w:spacing w:before="60" w:after="60"/>
+            </w:pPr>
+            <w:r>
+              <w:rPr>
+                <w:sz w:val="19"/>
+              </w:rPr>
+              <w:t>Active RAID registers</w:t>
+            </w:r>
+          </w:p>
+        </w:tc>
+      </w:tr>
+      <w:tr>
+        <w:tc>
+          <w:tcPr>
+            <w:tcW w:type="dxa" w:w="1872"/>
+            <w:shd w:val="clear" w:color="auto" w:fill="F8F9FA"/>
+          </w:tcPr>
+          <w:p>
+            <w:pPr>
+              <w:spacing w:before="60" w:after="60"/>
+            </w:pPr>
+            <w:r>
+              <w:rPr>
+                <w:sz w:val="19"/>
+              </w:rPr>
+              <w:t>plans</w:t>
+            </w:r>
+          </w:p>
+        </w:tc>
+        <w:tc>
+          <w:tcPr>
+            <w:tcW w:type="dxa" w:w="2592"/>
+            <w:shd w:val="clear" w:color="auto" w:fill="F8F9FA"/>
+          </w:tcPr>
+          <w:p>
+            <w:pPr>
+              <w:spacing w:before="60" w:after="60"/>
+            </w:pPr>
+            <w:r>
+              <w:rPr>
+                <w:sz w:val="19"/>
+              </w:rPr>
+              <w:t>Upcoming Plans</w:t>
+            </w:r>
+          </w:p>
+        </w:tc>
+        <w:tc>
+          <w:tcPr>
+            <w:tcW w:type="dxa" w:w="2016"/>
+            <w:shd w:val="clear" w:color="auto" w:fill="F8F9FA"/>
+          </w:tcPr>
+          <w:p>
+            <w:pPr>
+              <w:spacing w:before="60" w:after="60"/>
+            </w:pPr>
+            <w:r>
+              <w:rPr>
+                <w:sz w:val="19"/>
+              </w:rPr>
+              <w:t>Report Only</w:t>
+            </w:r>
+          </w:p>
+        </w:tc>
+        <w:tc>
+          <w:tcPr>
+            <w:tcW w:type="dxa" w:w="1296"/>
+            <w:shd w:val="clear" w:color="auto" w:fill="F8F9FA"/>
+          </w:tcPr>
+          <w:p>
+            <w:pPr>
+              <w:spacing w:before="60" w:after="60"/>
+            </w:pPr>
+            <w:r>
+              <w:rPr>
+                <w:sz w:val="19"/>
+              </w:rPr>
+              <w:t>Text Block</w:t>
+            </w:r>
+          </w:p>
+        </w:tc>
+        <w:tc>
+          <w:tcPr>
+            <w:tcW w:type="dxa" w:w="2304"/>
+            <w:shd w:val="clear" w:color="auto" w:fill="F8F9FA"/>
+          </w:tcPr>
+          <w:p>
+            <w:pPr>
+              <w:spacing w:before="60" w:after="60"/>
+            </w:pPr>
+            <w:r>
+              <w:rPr>
+                <w:sz w:val="19"/>
+              </w:rPr>
+              <w:t>User sprint plans</w:t>
+            </w:r>
+          </w:p>
+        </w:tc>
+      </w:tr>
+      <w:tr>
+        <w:tc>
+          <w:tcPr>
+            <w:tcW w:type="dxa" w:w="1872"/>
+            <w:shd w:val="clear" w:color="auto" w:fill="FFFFFF"/>
+          </w:tcPr>
+          <w:p>
+            <w:pPr>
+              <w:spacing w:before="60" w:after="60"/>
+            </w:pPr>
+            <w:r>
+              <w:rPr>
+                <w:sz w:val="19"/>
+              </w:rPr>
+              <w:t>team</w:t>
+            </w:r>
+          </w:p>
+        </w:tc>
+        <w:tc>
+          <w:tcPr>
+            <w:tcW w:type="dxa" w:w="2592"/>
+            <w:shd w:val="clear" w:color="auto" w:fill="FFFFFF"/>
+          </w:tcPr>
+          <w:p>
+            <w:pPr>
+              <w:spacing w:before="60" w:after="60"/>
+            </w:pPr>
+            <w:r>
+              <w:rPr>
+                <w:sz w:val="19"/>
+              </w:rPr>
+              <w:t>Team Workload Table</w:t>
+            </w:r>
+          </w:p>
+        </w:tc>
+        <w:tc>
+          <w:tcPr>
+            <w:tcW w:type="dxa" w:w="2016"/>
+            <w:shd w:val="clear" w:color="auto" w:fill="FFFFFF"/>
+          </w:tcPr>
+          <w:p>
+            <w:pPr>
+              <w:spacing w:before="60" w:after="60"/>
+            </w:pPr>
+            <w:r>
+              <w:rPr>
+                <w:sz w:val="19"/>
+              </w:rPr>
+              <w:t>Report Only</w:t>
+            </w:r>
+          </w:p>
+        </w:tc>
+        <w:tc>
+          <w:tcPr>
+            <w:tcW w:type="dxa" w:w="1296"/>
+            <w:shd w:val="clear" w:color="auto" w:fill="FFFFFF"/>
+          </w:tcPr>
+          <w:p>
+            <w:pPr>
+              <w:spacing w:before="60" w:after="60"/>
+            </w:pPr>
+            <w:r>
+              <w:rPr>
+                <w:sz w:val="19"/>
+              </w:rPr>
+              <w:t>Data Table</w:t>
+            </w:r>
+          </w:p>
+        </w:tc>
+        <w:tc>
+          <w:tcPr>
+            <w:tcW w:type="dxa" w:w="2304"/>
+            <w:shd w:val="clear" w:color="auto" w:fill="FFFFFF"/>
+          </w:tcPr>
+          <w:p>
+            <w:pPr>
+              <w:spacing w:before="60" w:after="60"/>
+            </w:pPr>
+            <w:r>
+              <w:rPr>
+                <w:sz w:val="19"/>
+              </w:rPr>
+              <w:t>Team allocations log</w:t>
+            </w:r>
+          </w:p>
+        </w:tc>
+      </w:tr>
+      <w:tr>
+        <w:tc>
+          <w:tcPr>
+            <w:tcW w:type="dxa" w:w="1872"/>
+            <w:shd w:val="clear" w:color="auto" w:fill="F8F9FA"/>
+          </w:tcPr>
+          <w:p>
+            <w:pPr>
+              <w:spacing w:before="60" w:after="60"/>
+            </w:pPr>
+            <w:r>
+              <w:rPr>
+                <w:sz w:val="19"/>
+              </w:rPr>
+              <w:t>util</w:t>
+            </w:r>
+          </w:p>
+        </w:tc>
+        <w:tc>
+          <w:tcPr>
+            <w:tcW w:type="dxa" w:w="2592"/>
+            <w:shd w:val="clear" w:color="auto" w:fill="F8F9FA"/>
+          </w:tcPr>
+          <w:p>
+            <w:pPr>
+              <w:spacing w:before="60" w:after="60"/>
+            </w:pPr>
+            <w:r>
+              <w:rPr>
+                <w:sz w:val="19"/>
+              </w:rPr>
+              <w:t>Resource Utilization Summary</w:t>
+            </w:r>
+          </w:p>
+        </w:tc>
+        <w:tc>
+          <w:tcPr>
+            <w:tcW w:type="dxa" w:w="2016"/>
+            <w:shd w:val="clear" w:color="auto" w:fill="F8F9FA"/>
+          </w:tcPr>
+          <w:p>
+            <w:pPr>
+              <w:spacing w:before="60" w:after="60"/>
+            </w:pPr>
+            <w:r>
+              <w:rPr>
+                <w:sz w:val="19"/>
+              </w:rPr>
+              <w:t>Report Only</w:t>
+            </w:r>
+          </w:p>
+        </w:tc>
+        <w:tc>
+          <w:tcPr>
+            <w:tcW w:type="dxa" w:w="1296"/>
+            <w:shd w:val="clear" w:color="auto" w:fill="F8F9FA"/>
+          </w:tcPr>
+          <w:p>
+            <w:pPr>
+              <w:spacing w:before="60" w:after="60"/>
+            </w:pPr>
+            <w:r>
+              <w:rPr>
+                <w:sz w:val="19"/>
+              </w:rPr>
+              <w:t>Metrics Cards</w:t>
+            </w:r>
+          </w:p>
+        </w:tc>
+        <w:tc>
+          <w:tcPr>
+            <w:tcW w:type="dxa" w:w="2304"/>
+            <w:shd w:val="clear" w:color="auto" w:fill="F8F9FA"/>
+          </w:tcPr>
+          <w:p>
+            <w:pPr>
+              <w:spacing w:before="60" w:after="60"/>
+            </w:pPr>
+            <w:r>
+              <w:rPr>
+                <w:sz w:val="19"/>
+              </w:rPr>
+              <w:t>Team capacity percentages</w:t>
+            </w:r>
+          </w:p>
+        </w:tc>
+      </w:tr>
+      <w:tr>
+        <w:tc>
+          <w:tcPr>
+            <w:tcW w:type="dxa" w:w="1872"/>
+            <w:shd w:val="clear" w:color="auto" w:fill="FFFFFF"/>
+          </w:tcPr>
+          <w:p>
+            <w:pPr>
+              <w:spacing w:before="60" w:after="60"/>
+            </w:pPr>
+            <w:r>
+              <w:rPr>
+                <w:sz w:val="19"/>
+              </w:rPr>
+              <w:t>overdue_tbl</w:t>
+            </w:r>
+          </w:p>
+        </w:tc>
+        <w:tc>
+          <w:tcPr>
+            <w:tcW w:type="dxa" w:w="2592"/>
+            <w:shd w:val="clear" w:color="auto" w:fill="FFFFFF"/>
+          </w:tcPr>
+          <w:p>
+            <w:pPr>
+              <w:spacing w:before="60" w:after="60"/>
+            </w:pPr>
+            <w:r>
+              <w:rPr>
+                <w:sz w:val="19"/>
+              </w:rPr>
+              <w:t>Overdue Table Detail</w:t>
+            </w:r>
+          </w:p>
+        </w:tc>
+        <w:tc>
+          <w:tcPr>
+            <w:tcW w:type="dxa" w:w="2016"/>
+            <w:shd w:val="clear" w:color="auto" w:fill="FFFFFF"/>
+          </w:tcPr>
+          <w:p>
+            <w:pPr>
+              <w:spacing w:before="60" w:after="60"/>
+            </w:pPr>
+            <w:r>
+              <w:rPr>
+                <w:sz w:val="19"/>
+              </w:rPr>
+              <w:t>Report Only</w:t>
+            </w:r>
+          </w:p>
+        </w:tc>
+        <w:tc>
+          <w:tcPr>
+            <w:tcW w:type="dxa" w:w="1296"/>
+            <w:shd w:val="clear" w:color="auto" w:fill="FFFFFF"/>
+          </w:tcPr>
+          <w:p>
+            <w:pPr>
+              <w:spacing w:before="60" w:after="60"/>
+            </w:pPr>
+            <w:r>
+              <w:rPr>
+                <w:sz w:val="19"/>
+              </w:rPr>
+              <w:t>Detailed Table</w:t>
+            </w:r>
+          </w:p>
+        </w:tc>
+        <w:tc>
+          <w:tcPr>
+            <w:tcW w:type="dxa" w:w="2304"/>
+            <w:shd w:val="clear" w:color="auto" w:fill="FFFFFF"/>
+          </w:tcPr>
+          <w:p>
+            <w:pPr>
+              <w:spacing w:before="60" w:after="60"/>
+            </w:pPr>
+            <w:r>
+              <w:rPr>
+                <w:sz w:val="19"/>
+              </w:rPr>
+              <w:t>Task delay register</w:t>
+            </w:r>
+          </w:p>
+        </w:tc>
+      </w:tr>
+    </w:tbl>
+    <w:p>
+      <w:pPr>
+        <w:spacing w:after="120"/>
+      </w:pPr>
+    </w:p>
+    <w:p/>
+    <w:p>
+      <w:pPr>
+        <w:pStyle w:val="Heading2"/>
+        <w:spacing w:before="360" w:after="120"/>
+      </w:pPr>
+      <w:r>
+        <w:rPr>
+          <w:color w:val="1E9ED5"/>
+        </w:rPr>
+        <w:t>14.2  Detailed Widget Descriptions &amp; Usage Instructions</w:t>
+      </w:r>
+    </w:p>
+    <w:p>
+      <w:pPr>
+        <w:pStyle w:val="Heading3"/>
+        <w:spacing w:before="360" w:after="120"/>
+      </w:pPr>
+      <w:r>
+        <w:rPr>
+          <w:color w:val="0D1B2A"/>
+        </w:rPr>
+        <w:t>14.2.1  Executive Summary (summary)</w:t>
+      </w:r>
+    </w:p>
+    <w:p>
+      <w:pPr>
+        <w:spacing w:before="0" w:after="80"/>
+      </w:pPr>
+      <w:r>
+        <w:rPr>
+          <w:sz w:val="21"/>
+        </w:rPr>
+        <w:t>• Description: The flagship dashboard widget combining the Health Index gauge with three KPI metrics cards.</w:t>
+        <w:br/>
+        <w:t>• Interpretation: The radial gauge arc transitions from Green (80-100: healthy) to Amber (50-79: warning) to Red (0-49: critical). It evaluates delivery confidence, Schedule Performance Index (SPI), and active RAID issues.</w:t>
+        <w:br/>
+        <w:t>• How to Use: Leadership uses this widget at startup to determine if a project requires recovery planning.</w:t>
+      </w:r>
+    </w:p>
+    <w:p>
+      <w:pPr>
+        <w:pStyle w:val="Heading3"/>
+        <w:spacing w:before="360" w:after="120"/>
+      </w:pPr>
+      <w:r>
+        <w:rPr>
+          <w:color w:val="0D1B2A"/>
+        </w:rPr>
+        <w:t>14.2.2  Project Health &amp; Quality (health)</w:t>
+      </w:r>
+    </w:p>
+    <w:p>
+      <w:pPr>
+        <w:spacing w:before="0" w:after="80"/>
+      </w:pPr>
+      <w:r>
+        <w:rPr>
+          <w:sz w:val="21"/>
+        </w:rPr>
+        <w:t>• Description: Two high-fidelity charts breaking down active project tasks by priority level and execution status.</w:t>
+        <w:br/>
+        <w:t>• Interpretation: Displays status splits (Not Started, In Progress, QA, Completed) in a stacked bar chart. A separate donut chart maps tasks by priority (Critical, High, Medium, Low).</w:t>
+        <w:br/>
+        <w:t>• How to Use: Project managers use this to check task distributions and ensure there isn't a bottleneck in the QA state.</w:t>
+      </w:r>
+    </w:p>
+    <w:p>
+      <w:pPr>
+        <w:pStyle w:val="Heading3"/>
+        <w:spacing w:before="360" w:after="120"/>
+      </w:pPr>
+      <w:r>
+        <w:rPr>
+          <w:color w:val="0D1B2A"/>
+        </w:rPr>
+        <w:t>14.2.3  Management Insights (mgmt_insights)</w:t>
+      </w:r>
+    </w:p>
+    <w:p>
+      <w:pPr>
+        <w:spacing w:before="0" w:after="80"/>
+      </w:pPr>
+      <w:r>
+        <w:rPr>
+          <w:sz w:val="21"/>
+        </w:rPr>
+        <w:t>• Description: A compound widget surfacing schedule pacing, high-priority risks, workload thresholds, and developer friction.</w:t>
+        <w:br/>
+        <w:t>• Interpretation: Flags tasks due within immediate (7d), mid-term (14d), and long-term (30d) horizons. Highlight cells turn red when overdue volume accumulates.</w:t>
+        <w:br/>
+        <w:t>• How to Use: Scrum masters check this daily to align task workloads with sprint capacity.</w:t>
+      </w:r>
+    </w:p>
+    <w:p>
+      <w:pPr>
+        <w:pStyle w:val="Heading3"/>
+        <w:spacing w:before="360" w:after="120"/>
+      </w:pPr>
+      <w:r>
+        <w:rPr>
+          <w:color w:val="0D1B2A"/>
+        </w:rPr>
+        <w:t>14.2.4  Executive Reporting (exec_reporting)</w:t>
+      </w:r>
+    </w:p>
+    <w:p>
+      <w:pPr>
+        <w:spacing w:before="0" w:after="80"/>
+      </w:pPr>
+      <w:r>
+        <w:rPr>
+          <w:sz w:val="21"/>
+        </w:rPr>
+        <w:t>• Description: High-density card presentation summarizing milestone achievements, critical path milestones, and RAID exposure levels.</w:t>
+        <w:br/>
+        <w:t>• Interpretation: Formatted with large text metrics and badge indicators, omitting technical logs for presentation cleanliness.</w:t>
+        <w:br/>
+        <w:t>• How to Use: Use this view to capture quick status screenshots for monthly steering committee slides.</w:t>
+      </w:r>
+    </w:p>
+    <w:p>
+      <w:pPr>
+        <w:pStyle w:val="Heading3"/>
+        <w:spacing w:before="360" w:after="120"/>
+      </w:pPr>
+      <w:r>
+        <w:rPr>
+          <w:color w:val="0D1B2A"/>
+        </w:rPr>
+        <w:t>14.2.5  Team Capacity Allocation (exec_capacity)</w:t>
+      </w:r>
+    </w:p>
+    <w:p>
+      <w:pPr>
+        <w:spacing w:before="0" w:after="80"/>
+      </w:pPr>
+      <w:r>
+        <w:rPr>
+          <w:sz w:val="21"/>
+        </w:rPr>
+        <w:t>• Description: Discloses planned working hours mapped against role capabilities.</w:t>
+        <w:br/>
+        <w:t>• Interpretation: Shows grid items per role (e.g. Lead Frontend) with a horizontal bar highlighting planned effort vs capacity.</w:t>
+        <w:br/>
+        <w:t>• How to Use: Use this to detect capacity shortfalls. If QA capacity is exceeded, adjust incoming feature scopes.</w:t>
+      </w:r>
+    </w:p>
+    <w:p>
+      <w:pPr>
+        <w:pStyle w:val="Heading3"/>
+        <w:spacing w:before="360" w:after="120"/>
+      </w:pPr>
+      <w:r>
+        <w:rPr>
+          <w:color w:val="0D1B2A"/>
+        </w:rPr>
+        <w:t>14.2.6  Strategic Module Status Matrix (module_matrix)</w:t>
+      </w:r>
+    </w:p>
+    <w:p>
+      <w:pPr>
+        <w:spacing w:before="0" w:after="80"/>
+      </w:pPr>
+      <w:r>
+        <w:rPr>
+          <w:sz w:val="21"/>
+        </w:rPr>
+        <w:t>• Description: Grid mapping code modules against development statuses.</w:t>
+        <w:br/>
+        <w:t>• Interpretation: Intersecting cells contain task counts. Features a progress bar reflecting completed vs total tasks per module.</w:t>
+        <w:br/>
+        <w:t>• How to Use: Evaluates module maturity. Ensure gateway or authentication modules are completed before starting GUI components.</w:t>
+      </w:r>
+    </w:p>
+    <w:p>
+      <w:pPr>
+        <w:pStyle w:val="Heading3"/>
+        <w:spacing w:before="360" w:after="120"/>
+      </w:pPr>
+      <w:r>
+        <w:rPr>
+          <w:color w:val="0D1B2A"/>
+        </w:rPr>
+        <w:t>14.2.7  Module &amp; Release Health (module_health)</w:t>
+      </w:r>
+    </w:p>
+    <w:p>
+      <w:pPr>
+        <w:spacing w:before="0" w:after="80"/>
+      </w:pPr>
+      <w:r>
+        <w:rPr>
+          <w:sz w:val="21"/>
+        </w:rPr>
+        <w:t>• Description: Quality index chart correlating active defects against code modules.</w:t>
+        <w:br/>
+        <w:t>• Interpretation: Assigns a health grade (A to F) to modules based on S1-S4 defect densities.</w:t>
+        <w:br/>
+        <w:t>• How to Use: Engineering managers check this to schedule technical debt refactoring sprints on modules with D/F grades.</w:t>
+      </w:r>
+    </w:p>
+    <w:p>
+      <w:pPr>
+        <w:pStyle w:val="Heading3"/>
+        <w:spacing w:before="360" w:after="120"/>
+      </w:pPr>
+      <w:r>
+        <w:rPr>
+          <w:color w:val="0D1B2A"/>
+        </w:rPr>
+        <w:t>14.2.8  Feature Intelligence (feature_insights)</w:t>
+      </w:r>
+    </w:p>
+    <w:p>
+      <w:pPr>
+        <w:spacing w:before="0" w:after="80"/>
+      </w:pPr>
+      <w:r>
+        <w:rPr>
+          <w:sz w:val="21"/>
+        </w:rPr>
+        <w:t>• Description: Bento grid showing delivery progress of functional user features.</w:t>
+        <w:br/>
+        <w:t>• Interpretation: Shows completion percentages, feature complexity scores, and associated risks.</w:t>
+        <w:br/>
+        <w:t>• How to Use: Product Owners use this to report feature release readiness to marketing stakeholders.</w:t>
+      </w:r>
+    </w:p>
+    <w:p>
+      <w:pPr>
+        <w:pStyle w:val="Heading3"/>
+        <w:spacing w:before="360" w:after="120"/>
+      </w:pPr>
+      <w:r>
+        <w:rPr>
+          <w:color w:val="0D1B2A"/>
+        </w:rPr>
+        <w:t>14.2.9  Screen Status Details (screen_status)</w:t>
+      </w:r>
+    </w:p>
+    <w:p>
+      <w:pPr>
+        <w:spacing w:before="0" w:after="80"/>
+      </w:pPr>
+      <w:r>
+        <w:rPr>
+          <w:sz w:val="21"/>
+        </w:rPr>
+        <w:t>• Description: Detailed tracker logging progress of frontend UI screens.</w:t>
+        <w:br/>
+        <w:t>• Interpretation: Grid lists screen names, linked module, and current design/development states.</w:t>
+        <w:br/>
+        <w:t>• How to Use: UI/UX designers check this to coordinate screen sign-offs with developers.</w:t>
+      </w:r>
+    </w:p>
+    <w:p>
+      <w:pPr>
+        <w:pStyle w:val="Heading3"/>
+        <w:spacing w:before="360" w:after="120"/>
+      </w:pPr>
+      <w:r>
+        <w:rPr>
+          <w:color w:val="0D1B2A"/>
+        </w:rPr>
+        <w:t>14.2.10  Release Timeline (release_timeline)</w:t>
+      </w:r>
+    </w:p>
+    <w:p>
+      <w:pPr>
+        <w:spacing w:before="0" w:after="80"/>
+      </w:pPr>
+      <w:r>
+        <w:rPr>
+          <w:sz w:val="21"/>
+        </w:rPr>
+        <w:t>• Description: Visual roadmap showing target dates and completion status of version releases.</w:t>
+        <w:br/>
+        <w:t>• Interpretation: Chronological timeline bar showing milestones (e.g. v1.0.0, v1.1.0) and status badges (Released, In Progress).</w:t>
+        <w:br/>
+        <w:t>• How to Use: Release managers use this to coordinate deployment windows and release notes.</w:t>
+      </w:r>
+    </w:p>
+    <w:p>
+      <w:pPr>
+        <w:pStyle w:val="Heading3"/>
+        <w:spacing w:before="360" w:after="120"/>
+      </w:pPr>
+      <w:r>
+        <w:rPr>
+          <w:color w:val="0D1B2A"/>
+        </w:rPr>
+        <w:t>14.2.11  Milestone Timeline (milestone_timeline)</w:t>
+      </w:r>
+    </w:p>
+    <w:p>
+      <w:pPr>
+        <w:spacing w:before="0" w:after="80"/>
+      </w:pPr>
+      <w:r>
+        <w:rPr>
+          <w:sz w:val="21"/>
+        </w:rPr>
+        <w:t>• Description: List tracking critical milestone deliverables.</w:t>
+        <w:br/>
+        <w:t>• Interpretation: Maps target dates against milestone completions. Completed milestones show green indicators.</w:t>
+        <w:br/>
+        <w:t>• How to Use: Program coordinators review this weekly to verify key phase gate completions.</w:t>
+      </w:r>
+    </w:p>
+    <w:p>
+      <w:pPr>
+        <w:pStyle w:val="Heading3"/>
+        <w:spacing w:before="360" w:after="120"/>
+      </w:pPr>
+      <w:r>
+        <w:rPr>
+          <w:color w:val="0D1B2A"/>
+        </w:rPr>
+        <w:t>14.2.12  Burndown Chart (burndown)</w:t>
+      </w:r>
+    </w:p>
+    <w:p>
+      <w:pPr>
+        <w:spacing w:before="0" w:after="80"/>
+      </w:pPr>
+      <w:r>
+        <w:rPr>
+          <w:sz w:val="21"/>
+        </w:rPr>
+        <w:t>• Description: SVG chart plotting total scope baseline against actual task completions.</w:t>
+        <w:br/>
+        <w:t>• Interpretation: X-axis represents weeks; Y-axis shows effort hours. The projection line forecast final dates.</w:t>
+        <w:br/>
+        <w:t>• How to Use: PMs use the burn-down projection to detect early signs of schedule slippage.</w:t>
+      </w:r>
+    </w:p>
+    <w:p>
+      <w:pPr>
+        <w:pStyle w:val="Heading3"/>
+        <w:spacing w:before="360" w:after="120"/>
+      </w:pPr>
+      <w:r>
+        <w:rPr>
+          <w:color w:val="0D1B2A"/>
+        </w:rPr>
+        <w:t>14.2.13  Weekly Velocity (velocity)</w:t>
+      </w:r>
+    </w:p>
+    <w:p>
+      <w:pPr>
+        <w:spacing w:before="0" w:after="80"/>
+      </w:pPr>
+      <w:r>
+        <w:rPr>
+          <w:sz w:val="21"/>
+        </w:rPr>
+        <w:t>• Description: Bar chart tracking effort completed week-over-week.</w:t>
+        <w:br/>
+        <w:t>• Interpretation: Each bar represents a week's total completed effort. Steady height shows stable throughput.</w:t>
+        <w:br/>
+        <w:t>• How to Use: PMs use average velocity to estimate capacity for future planning cycles.</w:t>
+      </w:r>
+    </w:p>
+    <w:p>
+      <w:pPr>
+        <w:pStyle w:val="Heading3"/>
+        <w:spacing w:before="360" w:after="120"/>
+      </w:pPr>
+      <w:r>
+        <w:rPr>
+          <w:color w:val="0D1B2A"/>
+        </w:rPr>
+        <w:t>14.2.14  Cumulative Flow Diagram (cfd)</w:t>
+      </w:r>
+    </w:p>
+    <w:p>
+      <w:pPr>
+        <w:spacing w:before="0" w:after="80"/>
+      </w:pPr>
+      <w:r>
+        <w:rPr>
+          <w:sz w:val="21"/>
+        </w:rPr>
+        <w:t>• Description: Area chart showing work items in various states over time.</w:t>
+        <w:br/>
+        <w:t>• Interpretation: Band widths show task counts in Not Started, In Progress, QA, and Completed. Bulging bands indicate bottlenecks.</w:t>
+        <w:br/>
+        <w:t>• How to Use: Identifies bottleneck areas. A widening 'QA' band implies a testing resource bottleneck.</w:t>
+      </w:r>
+    </w:p>
+    <w:p>
+      <w:pPr>
+        <w:pStyle w:val="Heading3"/>
+        <w:spacing w:before="360" w:after="120"/>
+      </w:pPr>
+      <w:r>
+        <w:rPr>
+          <w:color w:val="0D1B2A"/>
+        </w:rPr>
+        <w:t>14.2.15  Overdue Attention (overdue)</w:t>
+      </w:r>
+    </w:p>
+    <w:p>
+      <w:pPr>
+        <w:spacing w:before="0" w:after="80"/>
+      </w:pPr>
+      <w:r>
+        <w:rPr>
+          <w:sz w:val="21"/>
+        </w:rPr>
+        <w:t>• Description: List of tasks that have missed their due dates.</w:t>
+        <w:br/>
+        <w:t>• Interpretation: Displays task ID, name, assignee, and days overdue in red highlight.</w:t>
+        <w:br/>
+        <w:t>• How to Use: Team leads review this in stand-ups to assign help to delayed items.</w:t>
+      </w:r>
+    </w:p>
+    <w:p>
+      <w:pPr>
+        <w:pStyle w:val="Heading3"/>
+        <w:spacing w:before="360" w:after="120"/>
+      </w:pPr>
+      <w:r>
+        <w:rPr>
+          <w:color w:val="0D1B2A"/>
+        </w:rPr>
+        <w:t>14.2.16  High Impact Entities (high_impact_entities)</w:t>
+      </w:r>
+    </w:p>
+    <w:p>
+      <w:pPr>
+        <w:spacing w:before="0" w:after="80"/>
+      </w:pPr>
+      <w:r>
+        <w:rPr>
+          <w:sz w:val="21"/>
+        </w:rPr>
+        <w:t>• Description: Surfaced list of critical tasks that block the largest volume of downstream tasks.</w:t>
+        <w:br/>
+        <w:t>• Interpretation: Ranked by follower count. Items at the top are critical path nodes.</w:t>
+        <w:br/>
+        <w:t>• How to Use: Developers prioritize these tasks to unblock downstream dependent work items.</w:t>
+      </w:r>
+    </w:p>
+    <w:p>
+      <w:pPr>
+        <w:pStyle w:val="Heading3"/>
+        <w:spacing w:before="360" w:after="120"/>
+      </w:pPr>
+      <w:r>
+        <w:rPr>
+          <w:color w:val="0D1B2A"/>
+        </w:rPr>
+        <w:t>14.2.17  Team Workload (workload)</w:t>
+      </w:r>
+    </w:p>
+    <w:p>
+      <w:pPr>
+        <w:spacing w:before="0" w:after="80"/>
+      </w:pPr>
+      <w:r>
+        <w:rPr>
+          <w:sz w:val="21"/>
+        </w:rPr>
+        <w:t>• Description: Mapped chart showing workload hours assigned per team member.</w:t>
+        <w:br/>
+        <w:t>• Interpretation: Mapped against standard capacity limits (e.g. 40h). Highlights overallocated members.</w:t>
+        <w:br/>
+        <w:t>• How to Use: Balance assignments in scheduler to prevent burnout.</w:t>
+      </w:r>
+    </w:p>
+    <w:p>
+      <w:pPr>
+        <w:pStyle w:val="Heading3"/>
+        <w:spacing w:before="360" w:after="120"/>
+      </w:pPr>
+      <w:r>
+        <w:rPr>
+          <w:color w:val="0D1B2A"/>
+        </w:rPr>
+        <w:t>14.2.18  Category &amp; Effort (cat_hours)</w:t>
+      </w:r>
+    </w:p>
+    <w:p>
+      <w:pPr>
+        <w:spacing w:before="0" w:after="80"/>
+      </w:pPr>
+      <w:r>
+        <w:rPr>
+          <w:sz w:val="21"/>
+        </w:rPr>
+        <w:t>• Description: Donut chart showing effort hours distributed across task categories.</w:t>
+        <w:br/>
+        <w:t>• Interpretation: Segments show percentages spent on Feature, Bug, DevOps, Design, etc.</w:t>
+        <w:br/>
+        <w:t>• How to Use: Product Owners ensure focus aligns with goals, e.g., keeping bug effort below 20%.</w:t>
+      </w:r>
+    </w:p>
+    <w:p>
+      <w:pPr>
+        <w:pStyle w:val="Heading3"/>
+        <w:spacing w:before="360" w:after="120"/>
+      </w:pPr>
+      <w:r>
+        <w:rPr>
+          <w:color w:val="0D1B2A"/>
+        </w:rPr>
+        <w:t>14.2.19  Defect Intelligence (defect_intel)</w:t>
+      </w:r>
+    </w:p>
+    <w:p>
+      <w:pPr>
+        <w:spacing w:before="0" w:after="80"/>
+      </w:pPr>
+      <w:r>
+        <w:rPr>
+          <w:sz w:val="21"/>
+        </w:rPr>
+        <w:t>• Description: High density bento statistics card focusing on defect status and density metrics.</w:t>
+        <w:br/>
+        <w:t>• Interpretation: Features counts of active S1-S4 bugs and resolution rates.</w:t>
+        <w:br/>
+        <w:t>• How to Use: QA leads check this before release to ensure no S1 blocker defects are open.</w:t>
+      </w:r>
+    </w:p>
+    <w:p>
+      <w:pPr>
+        <w:pStyle w:val="Heading3"/>
+        <w:spacing w:before="360" w:after="120"/>
+      </w:pPr>
+      <w:r>
+        <w:rPr>
+          <w:color w:val="0D1B2A"/>
+        </w:rPr>
+        <w:t>14.2.20  Predictive Intelligence (intelligence)</w:t>
+      </w:r>
+    </w:p>
+    <w:p>
+      <w:pPr>
+        <w:spacing w:before="0" w:after="80"/>
+      </w:pPr>
+      <w:r>
+        <w:rPr>
+          <w:sz w:val="21"/>
+        </w:rPr>
+        <w:t>• Description: Forecast analytics widget displaying projected completion dates.</w:t>
+        <w:br/>
+        <w:t>• Interpretation: Evaluates actual effort velocities against baselines to predict delays.</w:t>
+        <w:br/>
+        <w:t>• How to Use: PMs use predictions for re-scoping before timelines are compromised.</w:t>
+      </w:r>
+    </w:p>
+    <w:p>
+      <w:pPr>
+        <w:pStyle w:val="Heading3"/>
+        <w:spacing w:before="360" w:after="120"/>
+      </w:pPr>
+      <w:r>
+        <w:rPr>
+          <w:color w:val="0D1B2A"/>
+        </w:rPr>
+        <w:t>14.2.21  Advanced Analytics (analytics)</w:t>
+      </w:r>
+    </w:p>
+    <w:p>
+      <w:pPr>
+        <w:spacing w:before="0" w:after="80"/>
+      </w:pPr>
+      <w:r>
+        <w:rPr>
+          <w:sz w:val="21"/>
+        </w:rPr>
+        <w:t>• Description: high-density table presenting Earned Value Management (EVM) values.</w:t>
+        <w:br/>
+        <w:t>• Interpretation: Tracks Earned Value (EV), Planned Value (PV), Schedule Variance (SV), and Schedule Performance Index (SPI).</w:t>
+        <w:br/>
+        <w:t>• How to Use: Finance and program managers review this for status reports.</w:t>
+      </w:r>
+    </w:p>
+    <w:p>
+      <w:pPr>
+        <w:pStyle w:val="Heading3"/>
+        <w:spacing w:before="360" w:after="120"/>
+      </w:pPr>
+      <w:r>
+        <w:rPr>
+          <w:color w:val="0D1B2A"/>
+        </w:rPr>
+        <w:t>14.2.22  Recent Activity (activity)</w:t>
+      </w:r>
+    </w:p>
+    <w:p>
+      <w:pPr>
+        <w:spacing w:before="0" w:after="80"/>
+      </w:pPr>
+      <w:r>
+        <w:rPr>
+          <w:sz w:val="21"/>
+        </w:rPr>
+        <w:t>• Description: Chronological audit trail showing system events.</w:t>
+        <w:br/>
+        <w:t>• Interpretation: Lists action events with timestamps and author details.</w:t>
+        <w:br/>
+        <w:t>• How to Use: Track accountability and audit changes in the workspace.</w:t>
+      </w:r>
+    </w:p>
+    <w:p>
+      <w:pPr>
+        <w:pStyle w:val="Heading3"/>
+        <w:spacing w:before="360" w:after="120"/>
+      </w:pPr>
+      <w:r>
+        <w:rPr>
+          <w:color w:val="0D1B2A"/>
+        </w:rPr>
+        <w:t>14.2.23  Executive Metrics (kpi_summary) [Report Only]</w:t>
+      </w:r>
+    </w:p>
+    <w:p>
+      <w:pPr>
+        <w:spacing w:before="0" w:after="80"/>
+      </w:pPr>
+      <w:r>
+        <w:rPr>
+          <w:sz w:val="21"/>
+        </w:rPr>
+        <w:t>• Description: Report card presenting key health indexes and delivery ratios.</w:t>
+        <w:br/>
+        <w:t>• Interpretation: Displays delivery confidence, SPI index, and RAID count in a structured print block.</w:t>
+        <w:br/>
+        <w:t>• How to Use: Pre-formatted block for steering committee reports.</w:t>
+      </w:r>
+    </w:p>
+    <w:p>
+      <w:pPr>
+        <w:pStyle w:val="Heading3"/>
+        <w:spacing w:before="360" w:after="120"/>
+      </w:pPr>
+      <w:r>
+        <w:rPr>
+          <w:color w:val="0D1B2A"/>
+        </w:rPr>
+        <w:t>14.2.24  Key Activities (activities) [Report Only]</w:t>
+      </w:r>
+    </w:p>
+    <w:p>
+      <w:pPr>
+        <w:spacing w:before="0" w:after="80"/>
+      </w:pPr>
+      <w:r>
+        <w:rPr>
+          <w:sz w:val="21"/>
+        </w:rPr>
+        <w:t>• Description: Text-editable widget to log key activities.</w:t>
+        <w:br/>
+        <w:t>• Interpretation: Users type text summary bullet points directly into the PDF preview panel.</w:t>
+        <w:br/>
+        <w:t>• How to Use: PMs write comments to explain anomalies.</w:t>
+      </w:r>
+    </w:p>
+    <w:p>
+      <w:pPr>
+        <w:pStyle w:val="Heading3"/>
+        <w:spacing w:before="360" w:after="120"/>
+      </w:pPr>
+      <w:r>
+        <w:rPr>
+          <w:color w:val="0D1B2A"/>
+        </w:rPr>
+        <w:t>14.2.25  Achievements (achievements) [Report Only]</w:t>
+      </w:r>
+    </w:p>
+    <w:p>
+      <w:pPr>
+        <w:spacing w:before="0" w:after="80"/>
+      </w:pPr>
+      <w:r>
+        <w:rPr>
+          <w:sz w:val="21"/>
+        </w:rPr>
+        <w:t>• Description: Showcase widget to highlight successes.</w:t>
+        <w:br/>
+        <w:t>• Interpretation: Editable text list formatted for callouts.</w:t>
+        <w:br/>
+        <w:t>• How to Use: Highlight milestones met in the reporting period.</w:t>
+      </w:r>
+    </w:p>
+    <w:p>
+      <w:pPr>
+        <w:pStyle w:val="Heading3"/>
+        <w:spacing w:before="360" w:after="120"/>
+      </w:pPr>
+      <w:r>
+        <w:rPr>
+          <w:color w:val="0D1B2A"/>
+        </w:rPr>
+        <w:t>14.2.26  Risks &amp; Issues (risks) [Report Only]</w:t>
+      </w:r>
+    </w:p>
+    <w:p>
+      <w:pPr>
+        <w:spacing w:before="0" w:after="80"/>
+      </w:pPr>
+      <w:r>
+        <w:rPr>
+          <w:sz w:val="21"/>
+        </w:rPr>
+        <w:t>• Description: Detailed RAID table for stakeholder reports.</w:t>
+        <w:br/>
+        <w:t>• Interpretation: Lists top active risks, mitigation plans, and owners.</w:t>
+        <w:br/>
+        <w:t>• How to Use: Simplifies presenting risk registers to stakeholders.</w:t>
+      </w:r>
+    </w:p>
+    <w:p>
+      <w:pPr>
+        <w:pStyle w:val="Heading3"/>
+        <w:spacing w:before="360" w:after="120"/>
+      </w:pPr>
+      <w:r>
+        <w:rPr>
+          <w:color w:val="0D1B2A"/>
+        </w:rPr>
+        <w:t>14.2.27  Upcoming Plans (plans) [Report Only]</w:t>
+      </w:r>
+    </w:p>
+    <w:p>
+      <w:pPr>
+        <w:spacing w:before="0" w:after="80"/>
+      </w:pPr>
+      <w:r>
+        <w:rPr>
+          <w:sz w:val="21"/>
+        </w:rPr>
+        <w:t>• Description: Text-editable section for upcoming plans.</w:t>
+        <w:br/>
+        <w:t>• Interpretation: Formatted text block for future objectives.</w:t>
+        <w:br/>
+        <w:t>• How to Use: Outline plans for the next reporting period.</w:t>
+      </w:r>
+    </w:p>
+    <w:p>
+      <w:pPr>
+        <w:pStyle w:val="Heading3"/>
+        <w:spacing w:before="360" w:after="120"/>
+      </w:pPr>
+      <w:r>
+        <w:rPr>
+          <w:color w:val="0D1B2A"/>
+        </w:rPr>
+        <w:t>14.2.28  Team Workload Table (team) [Report Only]</w:t>
+      </w:r>
+    </w:p>
+    <w:p>
+      <w:pPr>
+        <w:spacing w:before="0" w:after="80"/>
+      </w:pPr>
+      <w:r>
+        <w:rPr>
+          <w:sz w:val="21"/>
+        </w:rPr>
+        <w:t>• Description: Capacity overview table for reports.</w:t>
+        <w:br/>
+        <w:t>• Interpretation: Lists team member names, roles, and allocated hours.</w:t>
+        <w:br/>
+        <w:t>• How to Use: Verify workloads in stakeholder reports.</w:t>
+      </w:r>
+    </w:p>
+    <w:p>
+      <w:pPr>
+        <w:pStyle w:val="Heading3"/>
+        <w:spacing w:before="360" w:after="120"/>
+      </w:pPr>
+      <w:r>
+        <w:rPr>
+          <w:color w:val="0D1B2A"/>
+        </w:rPr>
+        <w:t>14.2.29  Resource Utilization Summary (util) [Report Only]</w:t>
+      </w:r>
+    </w:p>
+    <w:p>
+      <w:pPr>
+        <w:spacing w:before="0" w:after="80"/>
+      </w:pPr>
+      <w:r>
+        <w:rPr>
+          <w:sz w:val="21"/>
+        </w:rPr>
+        <w:t>• Description: High-level utilization stats.</w:t>
+        <w:br/>
+        <w:t>• Interpretation: Displays utilization percentages per role.</w:t>
+        <w:br/>
+        <w:t>• How to Use: Report resource efficiency to stakeholders.</w:t>
+      </w:r>
+    </w:p>
+    <w:p>
+      <w:pPr>
+        <w:pStyle w:val="Heading3"/>
+        <w:spacing w:before="360" w:after="120"/>
+      </w:pPr>
+      <w:r>
+        <w:rPr>
+          <w:color w:val="0D1B2A"/>
+        </w:rPr>
+        <w:t>14.2.30  Overdue Table Detail (overdue_tbl) [Report Only]</w:t>
+      </w:r>
+    </w:p>
+    <w:p>
+      <w:pPr>
+        <w:spacing w:before="0" w:after="80"/>
+      </w:pPr>
+      <w:r>
+        <w:rPr>
+          <w:sz w:val="21"/>
+        </w:rPr>
+        <w:t>• Description: Table of overdue tasks for reports.</w:t>
+        <w:br/>
+        <w:t>• Interpretation: Lists task name, assignee, and delay details.</w:t>
+        <w:br/>
+        <w:t>• How to Use: Highlight delayed tasks in stakeholder updates.</w:t>
+      </w:r>
+    </w:p>
+    <w:p>
+      <w:r>
+        <w:br w:type="page"/>
+      </w:r>
     </w:p>
     <w:sectPr>
       <w:footerReference w:type="default" r:id="rId9"/>

</xml_diff>